<commit_message>
Add correct tourist land-transport decree citation to Marco Legal
Decreto N.o 445/004 (mentioned in the earlier REFERENCIA draft) turned
out to regulate rental price indices, unrelated to tourism -- verified
against IMPO and found wrong. The correct rule is Decreto N.o 278/015
(13/10/2015), which implements Ley 19.253 specifically for tourist
transport companies and covers the circuit's minibus service.

Co-Authored-By: Claude Sonnet 5 <noreply@anthropic.com>
</commit_message>
<xml_diff>
--- a/La Ruta del Tannat - Proyecto Final.docx
+++ b/La Ruta del Tannat - Proyecto Final.docx
@@ -7706,7 +7706,7 @@
           <w:sz w:val="24"/>
           <w:szCs w:val="24"/>
         </w:rPr>
-        <w:t xml:space="preserve">La formalización y operación del circuito se rige por la Ley N.° 19.253 (Ley de Regulación de la Actividad Turística en Uruguay, IMPO, 2014), y el proyecto se alinea con sus disposiciones fundamentales. En cuanto a la declaración de interés nacional (Art. 1.º), el circuito promueve el crecimiento económico y el desarrollo cultural y social de la comunidad de Salto. En relación con el cumplimiento de los principios rectores (Art. 3.º), la propuesta incorpora la sostenibilidad —preservación de recursos naturales y agrícolas litorales—, la cooperación —mesa de cogestión público-privada—, la calidad —certificaciones internacionales de servicios— y la accesibilidad —goce del turismo para personas con discapacidad en todas las estaciones—. Respecto de la regulación de prácticas especializadas (Art. 25.º), la normativa clasifica al circuito como turismo especializado, exigiendo que guías y transportistas cuenten con registros y habilitaciones vigentes ante el MINTUR.</w:t>
+        <w:t xml:space="preserve">La formalización y operación del circuito se rige por la Ley N.° 19.253 (Ley de Regulación de la Actividad Turística en Uruguay, IMPO, 2014), y el proyecto se alinea con sus disposiciones fundamentales. En cuanto a la declaración de interés nacional (Art. 1.º), el circuito promueve el crecimiento económico y el desarrollo cultural y social de la comunidad de Salto. En relación con el cumplimiento de los principios rectores (Art. 3.º), la propuesta incorpora la sostenibilidad —preservación de recursos naturales y agrícolas litorales—, la cooperación —mesa de cogestión público-privada—, la calidad —certificaciones internacionales de servicios— y la accesibilidad —goce del turismo para personas con discapacidad en todas las estaciones—. Respecto de la regulación de prácticas especializadas (Art. 25.º), la normativa clasifica al circuito como turismo especializado, exigiendo que guías y transportistas cuenten con registros y habilitaciones vigentes ante el MINTUR. Esta última exigencia se reglamenta en concreto mediante el Decreto N.° 278/015 (Uruguay. Poder Ejecutivo, 2015), que regula a las empresas de transporte turístico —aplicable al servicio de minibuses previsto en el itinerario operativo (6.4)— y condiciona su actividad a la inscripción anual ante el MINTUR y a la constitución de una garantía de funcionamiento.</w:t>
       </w:r>
     </w:p>
     <w:p>
@@ -15397,6 +15397,26 @@
           <w:szCs w:val="24"/>
         </w:rPr>
         <w:t xml:space="preserve">Uruguay. Poder Ejecutivo. (2010). Decreto N.° 370/010: Regulación del Turismo Enológico. Marco Jurídico. Registro Nacional de Leyes y Decretos, Tomo 2, Semestre 2, Año 2010, p. 1420. IMPO. https://www.impo.com.uy/bases/decretos/370-2010</w:t>
+      </w:r>
+    </w:p>
+    <w:p>
+      <w:pPr>
+        <w:spacing w:after="160" w:line="240" w:lineRule="auto"/>
+        <w:ind w:left="720" w:hanging="720"/>
+        <w:jc w:val="left"/>
+      </w:pPr>
+      <w:r>
+        <w:rPr>
+          <w:rFonts w:ascii="Times New Roman" w:cs="Times New Roman" w:eastAsia="Times New Roman" w:hAnsi="Times New Roman"/>
+          <w:b w:val="false"/>
+          <w:bCs w:val="false"/>
+          <w:i w:val="false"/>
+          <w:iCs w:val="false"/>
+          <w:color w:val="000000"/>
+          <w:sz w:val="24"/>
+          <w:szCs w:val="24"/>
+        </w:rPr>
+        <w:t xml:space="preserve">Uruguay. Poder Ejecutivo. (2015). Decreto N.° 278/015: Reglamentación de la Ley N.° 19.253 relativa a la regulación de la actividad turística (empresas de transporte turístico). Diario Oficial, 20 de octubre de 2015. IMPO. https://www.impo.com.uy/bases/decretos/278-2015</w:t>
       </w:r>
     </w:p>
     <w:p>

</xml_diff>

<commit_message>
Update governance references, add heritage theory and methodology justification
- METS (Mesa Estratégica de Turismo de Salto) no longer operates as a
  unified body per current sources; replaced all operative references
  with the actual current coordination structure (Comisión de Turismo
  del CCIS + Comisión de Turismo de la Junta Departamental de Salto),
  reframing the FODA weakness accordingly, verified via 2025-2026 news.
- 2.2: added the concept of patrimonio histórico (heritage as social
  construction) citing Prats (1997), tying the Harriague/Tannat origin
  narrative to the chapter's experience-economy framework.
- 3.1: added methodological justification for the mixed-methods
  action-research approach, citing Hernández Sampieri et al. (2014).
- Added 4 corresponding reference entries.

Co-Authored-By: Claude Sonnet 5 <noreply@anthropic.com>
</commit_message>
<xml_diff>
--- a/La Ruta del Tannat - Proyecto Final.docx
+++ b/La Ruta del Tannat - Proyecto Final.docx
@@ -1349,6 +1349,26 @@
           <w:sz w:val="24"/>
           <w:szCs w:val="24"/>
         </w:rPr>
+        <w:t xml:space="preserve">A esta dimensión experiencial se suma el concepto de patrimonio histórico, entendido no como un vestigio inerte del pasado sino como una construcción social: según Prats (1997), el patrimonio se activa a partir de una memoria intersubjetiva —compartida por una comunidad— que selecciona y resignifica determinados referentes del pasado en función de las necesidades e intereses del presente. Bajo esta lógica, la figura de Pascual Harriague y el origen del Tannat en Salto no son un dato histórico neutro, sino un relato que la comunidad local activa deliberadamente para construir identidad y, en este caso, valor turístico. La experiencia transformadora que persigue el circuito se apoya, entonces, tanto en la inmersión sensorial descrita por Ahlfert y Urry como en esta dimensión patrimonial: el visitante no solo prueba un vino, sino que participa de la memoria colectiva que le da sentido.</w:t>
+      </w:r>
+    </w:p>
+    <w:p>
+      <w:pPr>
+        <w:keepNext w:val="false"/>
+        <w:spacing w:after="200" w:line="240" w:lineRule="auto"/>
+        <w:jc w:val="both"/>
+      </w:pPr>
+      <w:r>
+        <w:rPr>
+          <w:rFonts w:ascii="Arial" w:cs="Arial" w:eastAsia="Arial" w:hAnsi="Arial"/>
+          <w:b w:val="false"/>
+          <w:bCs w:val="false"/>
+          <w:i w:val="false"/>
+          <w:iCs w:val="false"/>
+          <w:color w:val="000000"/>
+          <w:sz w:val="24"/>
+          <w:szCs w:val="24"/>
+        </w:rPr>
         <w:t xml:space="preserve">En el medio rural, estos principios se concretan en itinerarios interactivos: el contacto directo con el productor, las degustaciones sensoriales guiadas y los recorridos interpretativos en el viñedo, que permiten comprender los ciclos biológicos de la vid y el manejo del suelo.</w:t>
       </w:r>
     </w:p>
@@ -1535,6 +1555,26 @@
           <w:szCs w:val="24"/>
         </w:rPr>
         <w:t xml:space="preserve">Se implementa un enfoque de investigación-acción de carácter mixto (cualitativo-cuantitativo) y alcance descriptivo-explicativo. Este diseño metodológico permite realizar un análisis riguroso de la situación actual y, simultáneamente, integrar a los actores locales en el diseño de la propuesta empresarial, facilitando la apropiación social de la ruta.</w:t>
+      </w:r>
+    </w:p>
+    <w:p>
+      <w:pPr>
+        <w:keepNext w:val="false"/>
+        <w:spacing w:after="200" w:line="240" w:lineRule="auto"/>
+        <w:jc w:val="both"/>
+      </w:pPr>
+      <w:r>
+        <w:rPr>
+          <w:rFonts w:ascii="Arial" w:cs="Arial" w:eastAsia="Arial" w:hAnsi="Arial"/>
+          <w:b w:val="false"/>
+          <w:bCs w:val="false"/>
+          <w:i w:val="false"/>
+          <w:iCs w:val="false"/>
+          <w:color w:val="000000"/>
+          <w:sz w:val="24"/>
+          <w:szCs w:val="24"/>
+        </w:rPr>
+        <w:t xml:space="preserve">Esta elección metodológica se fundamenta en Hernández Sampieri et al. (2014), quienes señalan que el enfoque mixto permite compensar las limitaciones de cada método por separado: la dimensión cuantitativa aporta la evidencia estadística necesaria para dimensionar el mercado y proyectar la viabilidad financiera de la propuesta (capítulos 4 y 6), mientras que la dimensión cualitativa —entrevistas, indagación en territorio— permite captar el significado que los propios actores locales (bodegas, Centro Vasco, operadores hoteleros) atribuyen al patrimonio vitivinícola de Salto, un insumo indispensable para diseñar un guion interpretativo fidedigno. El alcance descriptivo-explicativo se justifica, a su vez, porque el proyecto no se limita a describir la situación actual del destino, sino que busca explicar las causas de su bajo desempeño enoturístico —la desconexión estructural entre el producto termal y el patrimonio vitivinícola— para, a partir de ese diagnóstico, formular una propuesta de intervención. El componente de investigación-acción, por último, responde a la necesidad de involucrar a los actores del territorio como corresponsables del diseño de la ruta y no como meros informantes, favoreciendo su apropiación futura del proyecto.</w:t>
       </w:r>
     </w:p>
     <w:p>
@@ -5071,7 +5111,7 @@
           <w:sz w:val="24"/>
           <w:szCs w:val="24"/>
         </w:rPr>
-        <w:t xml:space="preserve">Entre las debilidades se identifica, en primer lugar, la escasa coordinación operativa entre la Mesa Estratégica de Turismo de Salto (METS), los operadores hoteleros y los guías turísticos. Se suma la vulnerabilidad climática en la caminería rural secundaria de Colonia Osimani y Parada Daymán, así como una brecha digital caracterizada por la falta de motores de reserva en tiempo real y de pasarelas de pago electrónico internacional en las bodegas pequeñas. También se advierte una deficiencia crítica en la señalética indicativa homologada por el MINTUR en la Ruta 3 y sus bifurcaciones. Por último, persisten un bajo volumen de producción y una centralización de la distribución en el sur del país.</w:t>
+        <w:t xml:space="preserve">Entre las debilidades se identifica, en primer lugar, la fragmentación de la gobernanza turística departamental: la antigua Mesa Estratégica de Turismo de Salto (METS), que en 2022 reunía en una sola instancia a la Intendencia de Salto, el Centro Comercial e Industrial de Salto (CCIS), la Liga de Turismo de Arapey y el sector hotelero (Intendencia de Salto, s.f.-b), dejó de funcionar como mesa unificada. La articulación actual se sostiene en diálogos bilaterales entre la Comisión de Turismo del CCIS y la Comisión de Turismo de la Junta Departamental de Salto (Diario Cambio, s.f.-d), sin una instancia permanente que integre también a los operadores hoteleros y a los guías turísticos. Se suma la vulnerabilidad climática en la caminería rural secundaria de Colonia Osimani y Parada Daymán, así como una brecha digital caracterizada por la falta de motores de reserva en tiempo real y de pasarelas de pago electrónico internacional en las bodegas pequeñas. También se advierte una deficiencia crítica en la señalética indicativa homologada por el MINTUR en la Ruta 3 y sus bifurcaciones. Por último, persisten un bajo volumen de producción y una centralización de la distribución en el sur del país.</w:t>
       </w:r>
     </w:p>
     <w:p>
@@ -6748,7 +6788,7 @@
           <w:sz w:val="24"/>
           <w:szCs w:val="24"/>
         </w:rPr>
-        <w:t xml:space="preserve">A partir de este análisis cruzado se desprenden cinco recomendaciones estratégicas para el Plan de Acción. En primer lugar, una gobernanza híbrida y vinculante, mediante la constitución del Comité de Gestión de la Ruta del Tannat, integrado por la METS, la Asociación de Vitivinicultores de Salto, guías locales y representantes hoteleros. En segundo lugar, la mitigación de la brecha de infraestructura, a través de alianzas con agencias receptivas que dispongan de vehículos utilitarios y de la gestión ante el MINTUR de la homologación de señalética específica para la Ruta 3. En tercer lugar, una digitalización orientada a la conversión inmediata, mediante una plataforma web unificada o un motor de reservas compartido con pasarela de pagos internacionales. En cuarto lugar, la hibridación del producto y la certificación sostenible, iniciando el proceso de certificación Uruguay Sustainable Winegrowing en las bodegas activas de la ruta. Por último, la activación del relato binacional y cultural, explotando la épica de Pascual Harriague y la herencia vasca, potenciada por la Semana de Harriague y su carácter binacional con Concordia.</w:t>
+        <w:t xml:space="preserve">A partir de este análisis cruzado se desprenden cinco recomendaciones estratégicas para el Plan de Acción. En primer lugar, una gobernanza híbrida y vinculante, mediante la constitución del Comité de Gestión de la Ruta del Tannat, integrado por la Comisión de Turismo del Centro Comercial e Industrial de Salto (CCIS), la Comisión de Turismo de la Junta Departamental de Salto, la Asociación de Vitivinicultores de Salto, guías locales y representantes hoteleros —supliendo así, para este circuito específico, la mesa unificada que dejó de operar tras el cierre de la METS—. En segundo lugar, la mitigación de la brecha de infraestructura, a través de alianzas con agencias receptivas que dispongan de vehículos utilitarios y de la gestión ante el MINTUR de la homologación de señalética específica para la Ruta 3. En tercer lugar, una digitalización orientada a la conversión inmediata, mediante una plataforma web unificada o un motor de reservas compartido con pasarela de pagos internacionales. En cuarto lugar, la hibridación del producto y la certificación sostenible, iniciando el proceso de certificación Uruguay Sustainable Winegrowing en las bodegas activas de la ruta. Por último, la activación del relato binacional y cultural, explotando la épica de Pascual Harriague y la herencia vasca, potenciada por la Semana de Harriague y su carácter binacional con Concordia.</w:t>
       </w:r>
     </w:p>
     <w:p>
@@ -7265,9 +7305,9 @@
         </w:tblBorders>
       </w:tblPr>
       <w:tblGrid>
-        <w:gridCol w:w="2106"/>
-        <w:gridCol w:w="5345"/>
-        <w:gridCol w:w="1053"/>
+        <w:gridCol w:w="2479"/>
+        <w:gridCol w:w="5034"/>
+        <w:gridCol w:w="991"/>
       </w:tblGrid>
       <w:tr>
         <w:trPr>
@@ -7275,7 +7315,7 @@
         </w:trPr>
         <w:tc>
           <w:tcPr>
-            <w:tcW w:type="dxa" w:w="2106"/>
+            <w:tcW w:type="dxa" w:w="2479"/>
             <w:shd w:fill="5b2333" w:val="clear"/>
             <w:tcMar>
               <w:top w:type="dxa" w:w="60"/>
@@ -7307,7 +7347,7 @@
         </w:tc>
         <w:tc>
           <w:tcPr>
-            <w:tcW w:type="dxa" w:w="5345"/>
+            <w:tcW w:type="dxa" w:w="5034"/>
             <w:shd w:fill="5b2333" w:val="clear"/>
             <w:tcMar>
               <w:top w:type="dxa" w:w="60"/>
@@ -7339,7 +7379,7 @@
         </w:tc>
         <w:tc>
           <w:tcPr>
-            <w:tcW w:type="dxa" w:w="1053"/>
+            <w:tcW w:type="dxa" w:w="991"/>
             <w:shd w:fill="5b2333" w:val="clear"/>
             <w:tcMar>
               <w:top w:type="dxa" w:w="60"/>
@@ -7376,7 +7416,7 @@
         </w:trPr>
         <w:tc>
           <w:tcPr>
-            <w:tcW w:type="dxa" w:w="2106"/>
+            <w:tcW w:type="dxa" w:w="2479"/>
             <w:tcMar>
               <w:top w:type="dxa" w:w="60"/>
               <w:left w:type="dxa" w:w="100"/>
@@ -7407,7 +7447,7 @@
         </w:tc>
         <w:tc>
           <w:tcPr>
-            <w:tcW w:type="dxa" w:w="5345"/>
+            <w:tcW w:type="dxa" w:w="5034"/>
             <w:tcMar>
               <w:top w:type="dxa" w:w="60"/>
               <w:left w:type="dxa" w:w="100"/>
@@ -7438,7 +7478,7 @@
         </w:tc>
         <w:tc>
           <w:tcPr>
-            <w:tcW w:type="dxa" w:w="1053"/>
+            <w:tcW w:type="dxa" w:w="991"/>
             <w:tcMar>
               <w:top w:type="dxa" w:w="60"/>
               <w:left w:type="dxa" w:w="100"/>
@@ -7474,7 +7514,7 @@
         </w:trPr>
         <w:tc>
           <w:tcPr>
-            <w:tcW w:type="dxa" w:w="2106"/>
+            <w:tcW w:type="dxa" w:w="2479"/>
             <w:tcMar>
               <w:top w:type="dxa" w:w="60"/>
               <w:left w:type="dxa" w:w="100"/>
@@ -7505,7 +7545,7 @@
         </w:tc>
         <w:tc>
           <w:tcPr>
-            <w:tcW w:type="dxa" w:w="5345"/>
+            <w:tcW w:type="dxa" w:w="5034"/>
             <w:tcMar>
               <w:top w:type="dxa" w:w="60"/>
               <w:left w:type="dxa" w:w="100"/>
@@ -7536,7 +7576,7 @@
         </w:tc>
         <w:tc>
           <w:tcPr>
-            <w:tcW w:type="dxa" w:w="1053"/>
+            <w:tcW w:type="dxa" w:w="991"/>
             <w:tcMar>
               <w:top w:type="dxa" w:w="60"/>
               <w:left w:type="dxa" w:w="100"/>
@@ -7572,38 +7612,38 @@
         </w:trPr>
         <w:tc>
           <w:tcPr>
-            <w:tcW w:type="dxa" w:w="2106"/>
-            <w:tcMar>
-              <w:top w:type="dxa" w:w="60"/>
-              <w:left w:type="dxa" w:w="100"/>
-              <w:bottom w:type="dxa" w:w="60"/>
-              <w:right w:type="dxa" w:w="100"/>
-            </w:tcMar>
-            <w:vAlign w:val="center"/>
-          </w:tcPr>
-          <w:p>
-            <w:pPr>
-              <w:spacing w:line="240" w:lineRule="auto"/>
-              <w:jc w:val="center"/>
-            </w:pPr>
-            <w:r>
-              <w:rPr>
-                <w:rFonts w:ascii="Arial" w:cs="Arial" w:eastAsia="Arial" w:hAnsi="Arial"/>
-                <w:b w:val="false"/>
-                <w:bCs w:val="false"/>
-                <w:i w:val="false"/>
-                <w:iCs w:val="false"/>
-                <w:color w:val="000000"/>
-                <w:sz w:val="20"/>
-                <w:szCs w:val="20"/>
-              </w:rPr>
-              <w:t xml:space="preserve">Mesa Estratégica de Turismo de Salto (METS) — enlace</w:t>
-            </w:r>
-          </w:p>
-        </w:tc>
-        <w:tc>
-          <w:tcPr>
-            <w:tcW w:type="dxa" w:w="5345"/>
+            <w:tcW w:type="dxa" w:w="2479"/>
+            <w:tcMar>
+              <w:top w:type="dxa" w:w="60"/>
+              <w:left w:type="dxa" w:w="100"/>
+              <w:bottom w:type="dxa" w:w="60"/>
+              <w:right w:type="dxa" w:w="100"/>
+            </w:tcMar>
+            <w:vAlign w:val="center"/>
+          </w:tcPr>
+          <w:p>
+            <w:pPr>
+              <w:spacing w:line="240" w:lineRule="auto"/>
+              <w:jc w:val="center"/>
+            </w:pPr>
+            <w:r>
+              <w:rPr>
+                <w:rFonts w:ascii="Arial" w:cs="Arial" w:eastAsia="Arial" w:hAnsi="Arial"/>
+                <w:b w:val="false"/>
+                <w:bCs w:val="false"/>
+                <w:i w:val="false"/>
+                <w:iCs w:val="false"/>
+                <w:color w:val="000000"/>
+                <w:sz w:val="20"/>
+                <w:szCs w:val="20"/>
+              </w:rPr>
+              <w:t xml:space="preserve">Comisión de Turismo del CCIS y de la Junta Departamental — enlace</w:t>
+            </w:r>
+          </w:p>
+        </w:tc>
+        <w:tc>
+          <w:tcPr>
+            <w:tcW w:type="dxa" w:w="5034"/>
             <w:tcMar>
               <w:top w:type="dxa" w:w="60"/>
               <w:left w:type="dxa" w:w="100"/>
@@ -7634,7 +7674,7 @@
         </w:tc>
         <w:tc>
           <w:tcPr>
-            <w:tcW w:type="dxa" w:w="1053"/>
+            <w:tcW w:type="dxa" w:w="991"/>
             <w:tcMar>
               <w:top w:type="dxa" w:w="60"/>
               <w:left w:type="dxa" w:w="100"/>
@@ -12793,10 +12833,10 @@
         </w:tblBorders>
       </w:tblPr>
       <w:tblGrid>
+        <w:gridCol w:w="842"/>
         <w:gridCol w:w="843"/>
-        <w:gridCol w:w="859"/>
-        <w:gridCol w:w="5307"/>
-        <w:gridCol w:w="1495"/>
+        <w:gridCol w:w="5206"/>
+        <w:gridCol w:w="1613"/>
       </w:tblGrid>
       <w:tr>
         <w:trPr>
@@ -12804,6 +12844,38 @@
         </w:trPr>
         <w:tc>
           <w:tcPr>
+            <w:tcW w:type="dxa" w:w="842"/>
+            <w:shd w:fill="5b2333" w:val="clear"/>
+            <w:tcMar>
+              <w:top w:type="dxa" w:w="60"/>
+              <w:left w:type="dxa" w:w="100"/>
+              <w:bottom w:type="dxa" w:w="60"/>
+              <w:right w:type="dxa" w:w="100"/>
+            </w:tcMar>
+            <w:vAlign w:val="center"/>
+          </w:tcPr>
+          <w:p>
+            <w:pPr>
+              <w:spacing w:line="240" w:lineRule="auto"/>
+              <w:jc w:val="center"/>
+            </w:pPr>
+            <w:r>
+              <w:rPr>
+                <w:rFonts w:ascii="Arial" w:cs="Arial" w:eastAsia="Arial" w:hAnsi="Arial"/>
+                <w:b/>
+                <w:bCs/>
+                <w:i w:val="false"/>
+                <w:iCs w:val="false"/>
+                <w:color w:val="ffffff"/>
+                <w:sz w:val="20"/>
+                <w:szCs w:val="20"/>
+              </w:rPr>
+              <w:t xml:space="preserve">Fase</w:t>
+            </w:r>
+          </w:p>
+        </w:tc>
+        <w:tc>
+          <w:tcPr>
             <w:tcW w:type="dxa" w:w="843"/>
             <w:shd w:fill="5b2333" w:val="clear"/>
             <w:tcMar>
@@ -12830,13 +12902,13 @@
                 <w:sz w:val="20"/>
                 <w:szCs w:val="20"/>
               </w:rPr>
-              <w:t xml:space="preserve">Fase</w:t>
-            </w:r>
-          </w:p>
-        </w:tc>
-        <w:tc>
-          <w:tcPr>
-            <w:tcW w:type="dxa" w:w="859"/>
+              <w:t xml:space="preserve">Plazo estimado</w:t>
+            </w:r>
+          </w:p>
+        </w:tc>
+        <w:tc>
+          <w:tcPr>
+            <w:tcW w:type="dxa" w:w="5206"/>
             <w:shd w:fill="5b2333" w:val="clear"/>
             <w:tcMar>
               <w:top w:type="dxa" w:w="60"/>
@@ -12862,45 +12934,13 @@
                 <w:sz w:val="20"/>
                 <w:szCs w:val="20"/>
               </w:rPr>
-              <w:t xml:space="preserve">Plazo estimado</w:t>
-            </w:r>
-          </w:p>
-        </w:tc>
-        <w:tc>
-          <w:tcPr>
-            <w:tcW w:type="dxa" w:w="5307"/>
-            <w:shd w:fill="5b2333" w:val="clear"/>
-            <w:tcMar>
-              <w:top w:type="dxa" w:w="60"/>
-              <w:left w:type="dxa" w:w="100"/>
-              <w:bottom w:type="dxa" w:w="60"/>
-              <w:right w:type="dxa" w:w="100"/>
-            </w:tcMar>
-            <w:vAlign w:val="center"/>
-          </w:tcPr>
-          <w:p>
-            <w:pPr>
-              <w:spacing w:line="240" w:lineRule="auto"/>
-              <w:jc w:val="center"/>
-            </w:pPr>
-            <w:r>
-              <w:rPr>
-                <w:rFonts w:ascii="Arial" w:cs="Arial" w:eastAsia="Arial" w:hAnsi="Arial"/>
-                <w:b/>
-                <w:bCs/>
-                <w:i w:val="false"/>
-                <w:iCs w:val="false"/>
-                <w:color w:val="ffffff"/>
-                <w:sz w:val="20"/>
-                <w:szCs w:val="20"/>
-              </w:rPr>
               <w:t xml:space="preserve">Actividades principales</w:t>
             </w:r>
           </w:p>
         </w:tc>
         <w:tc>
           <w:tcPr>
-            <w:tcW w:type="dxa" w:w="1495"/>
+            <w:tcW w:type="dxa" w:w="1613"/>
             <w:shd w:fill="5b2333" w:val="clear"/>
             <w:tcMar>
               <w:top w:type="dxa" w:w="60"/>
@@ -12937,6 +12977,37 @@
         </w:trPr>
         <w:tc>
           <w:tcPr>
+            <w:tcW w:type="dxa" w:w="842"/>
+            <w:tcMar>
+              <w:top w:type="dxa" w:w="60"/>
+              <w:left w:type="dxa" w:w="100"/>
+              <w:bottom w:type="dxa" w:w="60"/>
+              <w:right w:type="dxa" w:w="100"/>
+            </w:tcMar>
+            <w:vAlign w:val="center"/>
+          </w:tcPr>
+          <w:p>
+            <w:pPr>
+              <w:spacing w:line="240" w:lineRule="auto"/>
+              <w:jc w:val="center"/>
+            </w:pPr>
+            <w:r>
+              <w:rPr>
+                <w:rFonts w:ascii="Arial" w:cs="Arial" w:eastAsia="Arial" w:hAnsi="Arial"/>
+                <w:b w:val="false"/>
+                <w:bCs w:val="false"/>
+                <w:i w:val="false"/>
+                <w:iCs w:val="false"/>
+                <w:color w:val="000000"/>
+                <w:sz w:val="20"/>
+                <w:szCs w:val="20"/>
+              </w:rPr>
+              <w:t xml:space="preserve">0</w:t>
+            </w:r>
+          </w:p>
+        </w:tc>
+        <w:tc>
+          <w:tcPr>
             <w:tcW w:type="dxa" w:w="843"/>
             <w:tcMar>
               <w:top w:type="dxa" w:w="60"/>
@@ -12962,44 +13033,13 @@
                 <w:sz w:val="20"/>
                 <w:szCs w:val="20"/>
               </w:rPr>
-              <w:t xml:space="preserve">0</w:t>
-            </w:r>
-          </w:p>
-        </w:tc>
-        <w:tc>
-          <w:tcPr>
-            <w:tcW w:type="dxa" w:w="859"/>
-            <w:tcMar>
-              <w:top w:type="dxa" w:w="60"/>
-              <w:left w:type="dxa" w:w="100"/>
-              <w:bottom w:type="dxa" w:w="60"/>
-              <w:right w:type="dxa" w:w="100"/>
-            </w:tcMar>
-            <w:vAlign w:val="center"/>
-          </w:tcPr>
-          <w:p>
-            <w:pPr>
-              <w:spacing w:line="240" w:lineRule="auto"/>
-              <w:jc w:val="center"/>
-            </w:pPr>
-            <w:r>
-              <w:rPr>
-                <w:rFonts w:ascii="Arial" w:cs="Arial" w:eastAsia="Arial" w:hAnsi="Arial"/>
-                <w:b w:val="false"/>
-                <w:bCs w:val="false"/>
-                <w:i w:val="false"/>
-                <w:iCs w:val="false"/>
-                <w:color w:val="000000"/>
-                <w:sz w:val="20"/>
-                <w:szCs w:val="20"/>
-              </w:rPr>
               <w:t xml:space="preserve">Trimestre 1</w:t>
             </w:r>
           </w:p>
         </w:tc>
         <w:tc>
           <w:tcPr>
-            <w:tcW w:type="dxa" w:w="5307"/>
+            <w:tcW w:type="dxa" w:w="5206"/>
             <w:tcMar>
               <w:top w:type="dxa" w:w="60"/>
               <w:left w:type="dxa" w:w="100"/>
@@ -13030,32 +13070,32 @@
         </w:tc>
         <w:tc>
           <w:tcPr>
-            <w:tcW w:type="dxa" w:w="1495"/>
-            <w:tcMar>
-              <w:top w:type="dxa" w:w="60"/>
-              <w:left w:type="dxa" w:w="100"/>
-              <w:bottom w:type="dxa" w:w="60"/>
-              <w:right w:type="dxa" w:w="100"/>
-            </w:tcMar>
-            <w:vAlign w:val="center"/>
-          </w:tcPr>
-          <w:p>
-            <w:pPr>
-              <w:spacing w:line="240" w:lineRule="auto"/>
-              <w:jc w:val="center"/>
-            </w:pPr>
-            <w:r>
-              <w:rPr>
-                <w:rFonts w:ascii="Arial" w:cs="Arial" w:eastAsia="Arial" w:hAnsi="Arial"/>
-                <w:b w:val="false"/>
-                <w:bCs w:val="false"/>
-                <w:i w:val="false"/>
-                <w:iCs w:val="false"/>
-                <w:color w:val="000000"/>
-                <w:sz w:val="20"/>
-                <w:szCs w:val="20"/>
-              </w:rPr>
-              <w:t xml:space="preserve">Comité de Gestión / METS</w:t>
+            <w:tcW w:type="dxa" w:w="1613"/>
+            <w:tcMar>
+              <w:top w:type="dxa" w:w="60"/>
+              <w:left w:type="dxa" w:w="100"/>
+              <w:bottom w:type="dxa" w:w="60"/>
+              <w:right w:type="dxa" w:w="100"/>
+            </w:tcMar>
+            <w:vAlign w:val="center"/>
+          </w:tcPr>
+          <w:p>
+            <w:pPr>
+              <w:spacing w:line="240" w:lineRule="auto"/>
+              <w:jc w:val="center"/>
+            </w:pPr>
+            <w:r>
+              <w:rPr>
+                <w:rFonts w:ascii="Arial" w:cs="Arial" w:eastAsia="Arial" w:hAnsi="Arial"/>
+                <w:b w:val="false"/>
+                <w:bCs w:val="false"/>
+                <w:i w:val="false"/>
+                <w:iCs w:val="false"/>
+                <w:color w:val="000000"/>
+                <w:sz w:val="20"/>
+                <w:szCs w:val="20"/>
+              </w:rPr>
+              <w:t xml:space="preserve">Comité de Gestión / Comisión de Turismo CCIS</w:t>
             </w:r>
           </w:p>
         </w:tc>
@@ -13066,6 +13106,37 @@
         </w:trPr>
         <w:tc>
           <w:tcPr>
+            <w:tcW w:type="dxa" w:w="842"/>
+            <w:tcMar>
+              <w:top w:type="dxa" w:w="60"/>
+              <w:left w:type="dxa" w:w="100"/>
+              <w:bottom w:type="dxa" w:w="60"/>
+              <w:right w:type="dxa" w:w="100"/>
+            </w:tcMar>
+            <w:vAlign w:val="center"/>
+          </w:tcPr>
+          <w:p>
+            <w:pPr>
+              <w:spacing w:line="240" w:lineRule="auto"/>
+              <w:jc w:val="center"/>
+            </w:pPr>
+            <w:r>
+              <w:rPr>
+                <w:rFonts w:ascii="Arial" w:cs="Arial" w:eastAsia="Arial" w:hAnsi="Arial"/>
+                <w:b w:val="false"/>
+                <w:bCs w:val="false"/>
+                <w:i w:val="false"/>
+                <w:iCs w:val="false"/>
+                <w:color w:val="000000"/>
+                <w:sz w:val="20"/>
+                <w:szCs w:val="20"/>
+              </w:rPr>
+              <w:t xml:space="preserve">1</w:t>
+            </w:r>
+          </w:p>
+        </w:tc>
+        <w:tc>
+          <w:tcPr>
             <w:tcW w:type="dxa" w:w="843"/>
             <w:tcMar>
               <w:top w:type="dxa" w:w="60"/>
@@ -13091,44 +13162,13 @@
                 <w:sz w:val="20"/>
                 <w:szCs w:val="20"/>
               </w:rPr>
-              <w:t xml:space="preserve">1</w:t>
-            </w:r>
-          </w:p>
-        </w:tc>
-        <w:tc>
-          <w:tcPr>
-            <w:tcW w:type="dxa" w:w="859"/>
-            <w:tcMar>
-              <w:top w:type="dxa" w:w="60"/>
-              <w:left w:type="dxa" w:w="100"/>
-              <w:bottom w:type="dxa" w:w="60"/>
-              <w:right w:type="dxa" w:w="100"/>
-            </w:tcMar>
-            <w:vAlign w:val="center"/>
-          </w:tcPr>
-          <w:p>
-            <w:pPr>
-              <w:spacing w:line="240" w:lineRule="auto"/>
-              <w:jc w:val="center"/>
-            </w:pPr>
-            <w:r>
-              <w:rPr>
-                <w:rFonts w:ascii="Arial" w:cs="Arial" w:eastAsia="Arial" w:hAnsi="Arial"/>
-                <w:b w:val="false"/>
-                <w:bCs w:val="false"/>
-                <w:i w:val="false"/>
-                <w:iCs w:val="false"/>
-                <w:color w:val="000000"/>
-                <w:sz w:val="20"/>
-                <w:szCs w:val="20"/>
-              </w:rPr>
               <w:t xml:space="preserve">Trimestre 1-2</w:t>
             </w:r>
           </w:p>
         </w:tc>
         <w:tc>
           <w:tcPr>
-            <w:tcW w:type="dxa" w:w="5307"/>
+            <w:tcW w:type="dxa" w:w="5206"/>
             <w:tcMar>
               <w:top w:type="dxa" w:w="60"/>
               <w:left w:type="dxa" w:w="100"/>
@@ -13159,7 +13199,7 @@
         </w:tc>
         <w:tc>
           <w:tcPr>
-            <w:tcW w:type="dxa" w:w="1495"/>
+            <w:tcW w:type="dxa" w:w="1613"/>
             <w:tcMar>
               <w:top w:type="dxa" w:w="60"/>
               <w:left w:type="dxa" w:w="100"/>
@@ -13195,6 +13235,37 @@
         </w:trPr>
         <w:tc>
           <w:tcPr>
+            <w:tcW w:type="dxa" w:w="842"/>
+            <w:tcMar>
+              <w:top w:type="dxa" w:w="60"/>
+              <w:left w:type="dxa" w:w="100"/>
+              <w:bottom w:type="dxa" w:w="60"/>
+              <w:right w:type="dxa" w:w="100"/>
+            </w:tcMar>
+            <w:vAlign w:val="center"/>
+          </w:tcPr>
+          <w:p>
+            <w:pPr>
+              <w:spacing w:line="240" w:lineRule="auto"/>
+              <w:jc w:val="center"/>
+            </w:pPr>
+            <w:r>
+              <w:rPr>
+                <w:rFonts w:ascii="Arial" w:cs="Arial" w:eastAsia="Arial" w:hAnsi="Arial"/>
+                <w:b w:val="false"/>
+                <w:bCs w:val="false"/>
+                <w:i w:val="false"/>
+                <w:iCs w:val="false"/>
+                <w:color w:val="000000"/>
+                <w:sz w:val="20"/>
+                <w:szCs w:val="20"/>
+              </w:rPr>
+              <w:t xml:space="preserve">2</w:t>
+            </w:r>
+          </w:p>
+        </w:tc>
+        <w:tc>
+          <w:tcPr>
             <w:tcW w:type="dxa" w:w="843"/>
             <w:tcMar>
               <w:top w:type="dxa" w:w="60"/>
@@ -13220,44 +13291,13 @@
                 <w:sz w:val="20"/>
                 <w:szCs w:val="20"/>
               </w:rPr>
-              <w:t xml:space="preserve">2</w:t>
-            </w:r>
-          </w:p>
-        </w:tc>
-        <w:tc>
-          <w:tcPr>
-            <w:tcW w:type="dxa" w:w="859"/>
-            <w:tcMar>
-              <w:top w:type="dxa" w:w="60"/>
-              <w:left w:type="dxa" w:w="100"/>
-              <w:bottom w:type="dxa" w:w="60"/>
-              <w:right w:type="dxa" w:w="100"/>
-            </w:tcMar>
-            <w:vAlign w:val="center"/>
-          </w:tcPr>
-          <w:p>
-            <w:pPr>
-              <w:spacing w:line="240" w:lineRule="auto"/>
-              <w:jc w:val="center"/>
-            </w:pPr>
-            <w:r>
-              <w:rPr>
-                <w:rFonts w:ascii="Arial" w:cs="Arial" w:eastAsia="Arial" w:hAnsi="Arial"/>
-                <w:b w:val="false"/>
-                <w:bCs w:val="false"/>
-                <w:i w:val="false"/>
-                <w:iCs w:val="false"/>
-                <w:color w:val="000000"/>
-                <w:sz w:val="20"/>
-                <w:szCs w:val="20"/>
-              </w:rPr>
               <w:t xml:space="preserve">Trimestre 2-3</w:t>
             </w:r>
           </w:p>
         </w:tc>
         <w:tc>
           <w:tcPr>
-            <w:tcW w:type="dxa" w:w="5307"/>
+            <w:tcW w:type="dxa" w:w="5206"/>
             <w:tcMar>
               <w:top w:type="dxa" w:w="60"/>
               <w:left w:type="dxa" w:w="100"/>
@@ -13288,7 +13328,7 @@
         </w:tc>
         <w:tc>
           <w:tcPr>
-            <w:tcW w:type="dxa" w:w="1495"/>
+            <w:tcW w:type="dxa" w:w="1613"/>
             <w:tcMar>
               <w:top w:type="dxa" w:w="60"/>
               <w:left w:type="dxa" w:w="100"/>
@@ -13324,6 +13364,37 @@
         </w:trPr>
         <w:tc>
           <w:tcPr>
+            <w:tcW w:type="dxa" w:w="842"/>
+            <w:tcMar>
+              <w:top w:type="dxa" w:w="60"/>
+              <w:left w:type="dxa" w:w="100"/>
+              <w:bottom w:type="dxa" w:w="60"/>
+              <w:right w:type="dxa" w:w="100"/>
+            </w:tcMar>
+            <w:vAlign w:val="center"/>
+          </w:tcPr>
+          <w:p>
+            <w:pPr>
+              <w:spacing w:line="240" w:lineRule="auto"/>
+              <w:jc w:val="center"/>
+            </w:pPr>
+            <w:r>
+              <w:rPr>
+                <w:rFonts w:ascii="Arial" w:cs="Arial" w:eastAsia="Arial" w:hAnsi="Arial"/>
+                <w:b w:val="false"/>
+                <w:bCs w:val="false"/>
+                <w:i w:val="false"/>
+                <w:iCs w:val="false"/>
+                <w:color w:val="000000"/>
+                <w:sz w:val="20"/>
+                <w:szCs w:val="20"/>
+              </w:rPr>
+              <w:t xml:space="preserve">3</w:t>
+            </w:r>
+          </w:p>
+        </w:tc>
+        <w:tc>
+          <w:tcPr>
             <w:tcW w:type="dxa" w:w="843"/>
             <w:tcMar>
               <w:top w:type="dxa" w:w="60"/>
@@ -13349,44 +13420,13 @@
                 <w:sz w:val="20"/>
                 <w:szCs w:val="20"/>
               </w:rPr>
-              <w:t xml:space="preserve">3</w:t>
-            </w:r>
-          </w:p>
-        </w:tc>
-        <w:tc>
-          <w:tcPr>
-            <w:tcW w:type="dxa" w:w="859"/>
-            <w:tcMar>
-              <w:top w:type="dxa" w:w="60"/>
-              <w:left w:type="dxa" w:w="100"/>
-              <w:bottom w:type="dxa" w:w="60"/>
-              <w:right w:type="dxa" w:w="100"/>
-            </w:tcMar>
-            <w:vAlign w:val="center"/>
-          </w:tcPr>
-          <w:p>
-            <w:pPr>
-              <w:spacing w:line="240" w:lineRule="auto"/>
-              <w:jc w:val="center"/>
-            </w:pPr>
-            <w:r>
-              <w:rPr>
-                <w:rFonts w:ascii="Arial" w:cs="Arial" w:eastAsia="Arial" w:hAnsi="Arial"/>
-                <w:b w:val="false"/>
-                <w:bCs w:val="false"/>
-                <w:i w:val="false"/>
-                <w:iCs w:val="false"/>
-                <w:color w:val="000000"/>
-                <w:sz w:val="20"/>
-                <w:szCs w:val="20"/>
-              </w:rPr>
               <w:t xml:space="preserve">Trimestre 3</w:t>
             </w:r>
           </w:p>
         </w:tc>
         <w:tc>
           <w:tcPr>
-            <w:tcW w:type="dxa" w:w="5307"/>
+            <w:tcW w:type="dxa" w:w="5206"/>
             <w:tcMar>
               <w:top w:type="dxa" w:w="60"/>
               <w:left w:type="dxa" w:w="100"/>
@@ -13417,7 +13457,7 @@
         </w:tc>
         <w:tc>
           <w:tcPr>
-            <w:tcW w:type="dxa" w:w="1495"/>
+            <w:tcW w:type="dxa" w:w="1613"/>
             <w:tcMar>
               <w:top w:type="dxa" w:w="60"/>
               <w:left w:type="dxa" w:w="100"/>
@@ -13453,6 +13493,37 @@
         </w:trPr>
         <w:tc>
           <w:tcPr>
+            <w:tcW w:type="dxa" w:w="842"/>
+            <w:tcMar>
+              <w:top w:type="dxa" w:w="60"/>
+              <w:left w:type="dxa" w:w="100"/>
+              <w:bottom w:type="dxa" w:w="60"/>
+              <w:right w:type="dxa" w:w="100"/>
+            </w:tcMar>
+            <w:vAlign w:val="center"/>
+          </w:tcPr>
+          <w:p>
+            <w:pPr>
+              <w:spacing w:line="240" w:lineRule="auto"/>
+              <w:jc w:val="center"/>
+            </w:pPr>
+            <w:r>
+              <w:rPr>
+                <w:rFonts w:ascii="Arial" w:cs="Arial" w:eastAsia="Arial" w:hAnsi="Arial"/>
+                <w:b w:val="false"/>
+                <w:bCs w:val="false"/>
+                <w:i w:val="false"/>
+                <w:iCs w:val="false"/>
+                <w:color w:val="000000"/>
+                <w:sz w:val="20"/>
+                <w:szCs w:val="20"/>
+              </w:rPr>
+              <w:t xml:space="preserve">4</w:t>
+            </w:r>
+          </w:p>
+        </w:tc>
+        <w:tc>
+          <w:tcPr>
             <w:tcW w:type="dxa" w:w="843"/>
             <w:tcMar>
               <w:top w:type="dxa" w:w="60"/>
@@ -13478,44 +13549,13 @@
                 <w:sz w:val="20"/>
                 <w:szCs w:val="20"/>
               </w:rPr>
-              <w:t xml:space="preserve">4</w:t>
-            </w:r>
-          </w:p>
-        </w:tc>
-        <w:tc>
-          <w:tcPr>
-            <w:tcW w:type="dxa" w:w="859"/>
-            <w:tcMar>
-              <w:top w:type="dxa" w:w="60"/>
-              <w:left w:type="dxa" w:w="100"/>
-              <w:bottom w:type="dxa" w:w="60"/>
-              <w:right w:type="dxa" w:w="100"/>
-            </w:tcMar>
-            <w:vAlign w:val="center"/>
-          </w:tcPr>
-          <w:p>
-            <w:pPr>
-              <w:spacing w:line="240" w:lineRule="auto"/>
-              <w:jc w:val="center"/>
-            </w:pPr>
-            <w:r>
-              <w:rPr>
-                <w:rFonts w:ascii="Arial" w:cs="Arial" w:eastAsia="Arial" w:hAnsi="Arial"/>
-                <w:b w:val="false"/>
-                <w:bCs w:val="false"/>
-                <w:i w:val="false"/>
-                <w:iCs w:val="false"/>
-                <w:color w:val="000000"/>
-                <w:sz w:val="20"/>
-                <w:szCs w:val="20"/>
-              </w:rPr>
               <w:t xml:space="preserve">Trimestre 3-4</w:t>
             </w:r>
           </w:p>
         </w:tc>
         <w:tc>
           <w:tcPr>
-            <w:tcW w:type="dxa" w:w="5307"/>
+            <w:tcW w:type="dxa" w:w="5206"/>
             <w:tcMar>
               <w:top w:type="dxa" w:w="60"/>
               <w:left w:type="dxa" w:w="100"/>
@@ -13546,7 +13586,7 @@
         </w:tc>
         <w:tc>
           <w:tcPr>
-            <w:tcW w:type="dxa" w:w="1495"/>
+            <w:tcW w:type="dxa" w:w="1613"/>
             <w:tcMar>
               <w:top w:type="dxa" w:w="60"/>
               <w:left w:type="dxa" w:w="100"/>
@@ -13582,6 +13622,37 @@
         </w:trPr>
         <w:tc>
           <w:tcPr>
+            <w:tcW w:type="dxa" w:w="842"/>
+            <w:tcMar>
+              <w:top w:type="dxa" w:w="60"/>
+              <w:left w:type="dxa" w:w="100"/>
+              <w:bottom w:type="dxa" w:w="60"/>
+              <w:right w:type="dxa" w:w="100"/>
+            </w:tcMar>
+            <w:vAlign w:val="center"/>
+          </w:tcPr>
+          <w:p>
+            <w:pPr>
+              <w:spacing w:line="240" w:lineRule="auto"/>
+              <w:jc w:val="center"/>
+            </w:pPr>
+            <w:r>
+              <w:rPr>
+                <w:rFonts w:ascii="Arial" w:cs="Arial" w:eastAsia="Arial" w:hAnsi="Arial"/>
+                <w:b w:val="false"/>
+                <w:bCs w:val="false"/>
+                <w:i w:val="false"/>
+                <w:iCs w:val="false"/>
+                <w:color w:val="000000"/>
+                <w:sz w:val="20"/>
+                <w:szCs w:val="20"/>
+              </w:rPr>
+              <w:t xml:space="preserve">5</w:t>
+            </w:r>
+          </w:p>
+        </w:tc>
+        <w:tc>
+          <w:tcPr>
             <w:tcW w:type="dxa" w:w="843"/>
             <w:tcMar>
               <w:top w:type="dxa" w:w="60"/>
@@ -13607,44 +13678,13 @@
                 <w:sz w:val="20"/>
                 <w:szCs w:val="20"/>
               </w:rPr>
-              <w:t xml:space="preserve">5</w:t>
-            </w:r>
-          </w:p>
-        </w:tc>
-        <w:tc>
-          <w:tcPr>
-            <w:tcW w:type="dxa" w:w="859"/>
-            <w:tcMar>
-              <w:top w:type="dxa" w:w="60"/>
-              <w:left w:type="dxa" w:w="100"/>
-              <w:bottom w:type="dxa" w:w="60"/>
-              <w:right w:type="dxa" w:w="100"/>
-            </w:tcMar>
-            <w:vAlign w:val="center"/>
-          </w:tcPr>
-          <w:p>
-            <w:pPr>
-              <w:spacing w:line="240" w:lineRule="auto"/>
-              <w:jc w:val="center"/>
-            </w:pPr>
-            <w:r>
-              <w:rPr>
-                <w:rFonts w:ascii="Arial" w:cs="Arial" w:eastAsia="Arial" w:hAnsi="Arial"/>
-                <w:b w:val="false"/>
-                <w:bCs w:val="false"/>
-                <w:i w:val="false"/>
-                <w:iCs w:val="false"/>
-                <w:color w:val="000000"/>
-                <w:sz w:val="20"/>
-                <w:szCs w:val="20"/>
-              </w:rPr>
               <w:t xml:space="preserve">Trimestre 4</w:t>
             </w:r>
           </w:p>
         </w:tc>
         <w:tc>
           <w:tcPr>
-            <w:tcW w:type="dxa" w:w="5307"/>
+            <w:tcW w:type="dxa" w:w="5206"/>
             <w:tcMar>
               <w:top w:type="dxa" w:w="60"/>
               <w:left w:type="dxa" w:w="100"/>
@@ -13675,7 +13715,7 @@
         </w:tc>
         <w:tc>
           <w:tcPr>
-            <w:tcW w:type="dxa" w:w="1495"/>
+            <w:tcW w:type="dxa" w:w="1613"/>
             <w:tcMar>
               <w:top w:type="dxa" w:w="60"/>
               <w:left w:type="dxa" w:w="100"/>
@@ -13711,6 +13751,37 @@
         </w:trPr>
         <w:tc>
           <w:tcPr>
+            <w:tcW w:type="dxa" w:w="842"/>
+            <w:tcMar>
+              <w:top w:type="dxa" w:w="60"/>
+              <w:left w:type="dxa" w:w="100"/>
+              <w:bottom w:type="dxa" w:w="60"/>
+              <w:right w:type="dxa" w:w="100"/>
+            </w:tcMar>
+            <w:vAlign w:val="center"/>
+          </w:tcPr>
+          <w:p>
+            <w:pPr>
+              <w:spacing w:line="240" w:lineRule="auto"/>
+              <w:jc w:val="center"/>
+            </w:pPr>
+            <w:r>
+              <w:rPr>
+                <w:rFonts w:ascii="Arial" w:cs="Arial" w:eastAsia="Arial" w:hAnsi="Arial"/>
+                <w:b w:val="false"/>
+                <w:bCs w:val="false"/>
+                <w:i w:val="false"/>
+                <w:iCs w:val="false"/>
+                <w:color w:val="000000"/>
+                <w:sz w:val="20"/>
+                <w:szCs w:val="20"/>
+              </w:rPr>
+              <w:t xml:space="preserve">6</w:t>
+            </w:r>
+          </w:p>
+        </w:tc>
+        <w:tc>
+          <w:tcPr>
             <w:tcW w:type="dxa" w:w="843"/>
             <w:tcMar>
               <w:top w:type="dxa" w:w="60"/>
@@ -13736,44 +13807,13 @@
                 <w:sz w:val="20"/>
                 <w:szCs w:val="20"/>
               </w:rPr>
-              <w:t xml:space="preserve">6</w:t>
-            </w:r>
-          </w:p>
-        </w:tc>
-        <w:tc>
-          <w:tcPr>
-            <w:tcW w:type="dxa" w:w="859"/>
-            <w:tcMar>
-              <w:top w:type="dxa" w:w="60"/>
-              <w:left w:type="dxa" w:w="100"/>
-              <w:bottom w:type="dxa" w:w="60"/>
-              <w:right w:type="dxa" w:w="100"/>
-            </w:tcMar>
-            <w:vAlign w:val="center"/>
-          </w:tcPr>
-          <w:p>
-            <w:pPr>
-              <w:spacing w:line="240" w:lineRule="auto"/>
-              <w:jc w:val="center"/>
-            </w:pPr>
-            <w:r>
-              <w:rPr>
-                <w:rFonts w:ascii="Arial" w:cs="Arial" w:eastAsia="Arial" w:hAnsi="Arial"/>
-                <w:b w:val="false"/>
-                <w:bCs w:val="false"/>
-                <w:i w:val="false"/>
-                <w:iCs w:val="false"/>
-                <w:color w:val="000000"/>
-                <w:sz w:val="20"/>
-                <w:szCs w:val="20"/>
-              </w:rPr>
               <w:t xml:space="preserve">Trimestre 4 en adelante</w:t>
             </w:r>
           </w:p>
         </w:tc>
         <w:tc>
           <w:tcPr>
-            <w:tcW w:type="dxa" w:w="5307"/>
+            <w:tcW w:type="dxa" w:w="5206"/>
             <w:tcMar>
               <w:top w:type="dxa" w:w="60"/>
               <w:left w:type="dxa" w:w="100"/>
@@ -13804,7 +13844,7 @@
         </w:tc>
         <w:tc>
           <w:tcPr>
-            <w:tcW w:type="dxa" w:w="1495"/>
+            <w:tcW w:type="dxa" w:w="1613"/>
             <w:tcMar>
               <w:top w:type="dxa" w:w="60"/>
               <w:left w:type="dxa" w:w="100"/>
@@ -14179,7 +14219,7 @@
           <w:sz w:val="24"/>
           <w:szCs w:val="24"/>
         </w:rPr>
-        <w:t xml:space="preserve">Centro de Estudios de la Realidad Económica y Social [CERES]. (2026). Monitor de Actividad Turística (marzo, 2026).</w:t>
+        <w:t xml:space="preserve">Centro Comercial e Industrial de Salto [CCIS]. (s.f.). Comisión Turismo. https://www.ccisalto.com.uy/comision-turismo</w:t>
       </w:r>
     </w:p>
     <w:p>
@@ -14199,7 +14239,7 @@
           <w:sz w:val="24"/>
           <w:szCs w:val="24"/>
         </w:rPr>
-        <w:t xml:space="preserve">Cipetur. (s.f.). Enoturismo en Uruguay: cultura, paisaje y sabor. https://www.cipetur.com/index.php/cipetur/destinos/item/7369-enoturismo-en-uruguay-cultura-paisaje-y-sabor</w:t>
+        <w:t xml:space="preserve">Centro de Estudios de la Realidad Económica y Social [CERES]. (2026). Monitor de Actividad Turística (marzo, 2026).</w:t>
       </w:r>
     </w:p>
     <w:p>
@@ -14219,7 +14259,7 @@
           <w:sz w:val="24"/>
           <w:szCs w:val="24"/>
         </w:rPr>
-        <w:t xml:space="preserve">Diario Cambio. (s.f.-a). Salto fuera de la lista de las cinco ciudades más visitadas por turismo. https://diariocambio.com.uy/salto-fuera-de-la-lista-de-las-cinco-ciudades-mas-visitadas-por-turismo</w:t>
+        <w:t xml:space="preserve">Cipetur. (s.f.). Enoturismo en Uruguay: cultura, paisaje y sabor. https://www.cipetur.com/index.php/cipetur/destinos/item/7369-enoturismo-en-uruguay-cultura-paisaje-y-sabor</w:t>
       </w:r>
     </w:p>
     <w:p>
@@ -14239,7 +14279,7 @@
           <w:sz w:val="24"/>
           <w:szCs w:val="24"/>
         </w:rPr>
-        <w:t xml:space="preserve">Diario Cambio. (s.f.-b). Bertolini &amp; Broglio y Salto Chico obtuvieron medallas de oro en el concurso «Tannat al Mundo». https://diariocambio.com.uy/bertolini-broglio-y-salto-chico-obtuvieron-medallas-de-oro-en-el-concurso-tannat-al-mundo</w:t>
+        <w:t xml:space="preserve">Diario Cambio. (s.f.-a). Salto fuera de la lista de las cinco ciudades más visitadas por turismo. https://diariocambio.com.uy/salto-fuera-de-la-lista-de-las-cinco-ciudades-mas-visitadas-por-turismo</w:t>
       </w:r>
     </w:p>
     <w:p>
@@ -14259,7 +14299,7 @@
           <w:sz w:val="24"/>
           <w:szCs w:val="24"/>
         </w:rPr>
-        <w:t xml:space="preserve">Diario Cambio. (s.f.-c). Las lluvias y el agua acumulada en pocos días complican situación de caminería rural en varias zonas. https://diariocambio.com.uy/las-lluvias-y-el-agua-acumulada-en-pocos-dias-complican-situacion-de-camineria-rural-en-varias</w:t>
+        <w:t xml:space="preserve">Diario Cambio. (s.f.-b). Bertolini &amp; Broglio y Salto Chico obtuvieron medallas de oro en el concurso «Tannat al Mundo». https://diariocambio.com.uy/bertolini-broglio-y-salto-chico-obtuvieron-medallas-de-oro-en-el-concurso-tannat-al-mundo</w:t>
       </w:r>
     </w:p>
     <w:p>
@@ -14279,7 +14319,7 @@
           <w:sz w:val="24"/>
           <w:szCs w:val="24"/>
         </w:rPr>
-        <w:t xml:space="preserve">Diario El Debate Pregón. (s.f.). La brecha de precios entre Argentina y Uruguay volvió a ampliarse y llega al 40% en la frontera. https://www.diariodebatepregon.com/argentina-y-el-mundo/la-brecha-de-precios-entre-argentina-y-uruguay-volvio-a-ampliarse-y-llega-al-40-en-la-frontera</w:t>
+        <w:t xml:space="preserve">Diario Cambio. (s.f.-c). Las lluvias y el agua acumulada en pocos días complican situación de caminería rural en varias zonas. https://diariocambio.com.uy/las-lluvias-y-el-agua-acumulada-en-pocos-dias-complican-situacion-de-camineria-rural-en-varias</w:t>
       </w:r>
     </w:p>
     <w:p>
@@ -14299,7 +14339,7 @@
           <w:sz w:val="24"/>
           <w:szCs w:val="24"/>
         </w:rPr>
-        <w:t xml:space="preserve">Diario Río Uruguay. (s.f.). Desde Uruguay destacan que un importante número de concordienses siguen eligiendo los resort termales "all inclusive". http://diarioriouruguay.com/turismo/desde-uruguay-destacan-que-un-importante-nmero-de-concordienses-siguen-eligiendo-los-resort-termales-ldquoall-inclusiverdquo.htm</w:t>
+        <w:t xml:space="preserve">Diario Cambio. (s.f.-d). Diálogo estratégico abordó la situación del turismo y normativas para el sector. https://www.diariocambio.com.uy/dialogo-estrategico-abordo-la-situacion-del-turismo-y-normativas-para-el-sector</w:t>
       </w:r>
     </w:p>
     <w:p>
@@ -14319,7 +14359,7 @@
           <w:sz w:val="24"/>
           <w:szCs w:val="24"/>
         </w:rPr>
-        <w:t xml:space="preserve">El Entre Ríos. (s.f.). "Salto, cuna del Tannat" se une a Concordia para homenajear a Pascual Harriague. https://www.elentrerios.com/actualidad/ldquosalto-cuna-del-tannatrdquo-se-une-a-concordia-para-homenajear-a-pascual-harriague.htm</w:t>
+        <w:t xml:space="preserve">Diario El Debate Pregón. (s.f.). La brecha de precios entre Argentina y Uruguay volvió a ampliarse y llega al 40% en la frontera. https://www.diariodebatepregon.com/argentina-y-el-mundo/la-brecha-de-precios-entre-argentina-y-uruguay-volvio-a-ampliarse-y-llega-al-40-en-la-frontera</w:t>
       </w:r>
     </w:p>
     <w:p>
@@ -14339,7 +14379,7 @@
           <w:sz w:val="24"/>
           <w:szCs w:val="24"/>
         </w:rPr>
-        <w:t xml:space="preserve">El País. (s.f.). Argentina, y algo menos Brasil, se encarecen para los uruguayos, aunque hay rubros que están "baratos", ¿qué brechas hay? https://www.elpais.com.uy/negocios/noticias/argentina-y-algo-menos-brasil-se-encarecen-para-las-uruguayos-aunque-hay-rubros-que-estan-baratos-que-brechas-hay</w:t>
+        <w:t xml:space="preserve">Diario Río Uruguay. (s.f.). Desde Uruguay destacan que un importante número de concordienses siguen eligiendo los resort termales "all inclusive". http://diarioriouruguay.com/turismo/desde-uruguay-destacan-que-un-importante-nmero-de-concordienses-siguen-eligiendo-los-resort-termales-ldquoall-inclusiverdquo.htm</w:t>
       </w:r>
     </w:p>
     <w:p>
@@ -14359,7 +14399,7 @@
           <w:sz w:val="24"/>
           <w:szCs w:val="24"/>
         </w:rPr>
-        <w:t xml:space="preserve">El Pueblo Digital. (2026). Semana de Harriague 2026: Salto celebra la cuna del Tannat. https://elpueblodigital.uy/salto-cuna-del-tannat-comienza-una-semana-para-celebrar-nuestra-identidad-y-legado/</w:t>
+        <w:t xml:space="preserve">El Entre Ríos. (s.f.). "Salto, cuna del Tannat" se une a Concordia para homenajear a Pascual Harriague. https://www.elentrerios.com/actualidad/ldquosalto-cuna-del-tannatrdquo-se-une-a-concordia-para-homenajear-a-pascual-harriague.htm</w:t>
       </w:r>
     </w:p>
     <w:p>
@@ -14379,7 +14419,7 @@
           <w:sz w:val="24"/>
           <w:szCs w:val="24"/>
         </w:rPr>
-        <w:t xml:space="preserve">Entre Ríos Hoy. (s.f.). Termas y enoturismo: la fórmula que potencia los atractivos que Entre Ríos ofrece a los visitantes. https://entrerioshoy.com/termas-y-enoturismo-la-formula-que-potencia-los-atractivos-que-entre-rios-ofrece-a-los-visitantes/</w:t>
+        <w:t xml:space="preserve">El País. (s.f.). Argentina, y algo menos Brasil, se encarecen para los uruguayos, aunque hay rubros que están "baratos", ¿qué brechas hay? https://www.elpais.com.uy/negocios/noticias/argentina-y-algo-menos-brasil-se-encarecen-para-las-uruguayos-aunque-hay-rubros-que-estan-baratos-que-brechas-hay</w:t>
       </w:r>
     </w:p>
     <w:p>
@@ -14399,7 +14439,7 @@
           <w:sz w:val="24"/>
           <w:szCs w:val="24"/>
         </w:rPr>
-        <w:t xml:space="preserve">Euskalkultura.eus. (s.f.). Tras la exitosa gestión del CV local, se pone en marcha el proyecto de recuperar la antigua Bodega Harriague de Salto (y II). https://www.euskalkultura.eus/espanol/noticias/tras-la-exitosa-gestion-del-cv-local-se-pone-en-marcha-el-proyecto-de-recuperar-la-antigua-bodega-harriague-de-salto-y-ii</w:t>
+        <w:t xml:space="preserve">El Pueblo Digital. (2026). Semana de Harriague 2026: Salto celebra la cuna del Tannat. https://elpueblodigital.uy/salto-cuna-del-tannat-comienza-una-semana-para-celebrar-nuestra-identidad-y-legado/</w:t>
       </w:r>
     </w:p>
     <w:p>
@@ -14419,7 +14459,7 @@
           <w:sz w:val="24"/>
           <w:szCs w:val="24"/>
         </w:rPr>
-        <w:t xml:space="preserve">Gran Logia de la Masonería del Uruguay. (s.f.). Pascual Harriague. https://www.masoneriadeluruguay.org/es/pascual-harriague</w:t>
+        <w:t xml:space="preserve">Entre Ríos Hoy. (s.f.). Termas y enoturismo: la fórmula que potencia los atractivos que Entre Ríos ofrece a los visitantes. https://entrerioshoy.com/termas-y-enoturismo-la-formula-que-potencia-los-atractivos-que-entre-rios-ofrece-a-los-visitantes/</w:t>
       </w:r>
     </w:p>
     <w:p>
@@ -14439,7 +14479,7 @@
           <w:sz w:val="24"/>
           <w:szCs w:val="24"/>
         </w:rPr>
-        <w:t xml:space="preserve">Infobae. (2023, 16 de noviembre). Brecha cambiaria: ir de turista a las termas en Uruguay cuesta 118% más caro que a las de Argentina. https://www.infobae.com/america/america-latina/2023/11/16/brecha-cambiaria-ir-de-turista-a-las-termas-en-uruguay-cuesta-118-mas-caro-que-a-las-de-argentina/</w:t>
+        <w:t xml:space="preserve">Euskalkultura.eus. (s.f.). Tras la exitosa gestión del CV local, se pone en marcha el proyecto de recuperar la antigua Bodega Harriague de Salto (y II). https://www.euskalkultura.eus/espanol/noticias/tras-la-exitosa-gestion-del-cv-local-se-pone-en-marcha-el-proyecto-de-recuperar-la-antigua-bodega-harriague-de-salto-y-ii</w:t>
       </w:r>
     </w:p>
     <w:p>
@@ -14459,7 +14499,7 @@
           <w:sz w:val="24"/>
           <w:szCs w:val="24"/>
         </w:rPr>
-        <w:t xml:space="preserve">Instituto de Promoción de la Inversión y las Exportaciones de Bienes y Servicios [IMPO]. (2014). Ley N.º 19.253: Regulación de la actividad turística y declaratoria de interés nacional. https://www.impo.com.uy/bases/leyes/19253-2014</w:t>
+        <w:t xml:space="preserve">Gran Logia de la Masonería del Uruguay. (s.f.). Pascual Harriague. https://www.masoneriadeluruguay.org/es/pascual-harriague</w:t>
       </w:r>
     </w:p>
     <w:p>
@@ -14479,7 +14519,7 @@
           <w:sz w:val="24"/>
           <w:szCs w:val="24"/>
         </w:rPr>
-        <w:t xml:space="preserve">Instituto Nacional de Vitivinicultura [INAVI] &amp; Opción Consultores. (2023). Estudio consolidado de la actividad económica e impacto del enoturismo en Uruguay. INAVI.</w:t>
+        <w:t xml:space="preserve">Hernández Sampieri, R., Fernández Collado, C., &amp; Baptista Lucio, P. (2014). Metodología de la investigación (6.ª ed.). McGraw-Hill.</w:t>
       </w:r>
     </w:p>
     <w:p>
@@ -14499,7 +14539,7 @@
           <w:sz w:val="24"/>
           <w:szCs w:val="24"/>
         </w:rPr>
-        <w:t xml:space="preserve">Instituto Nacional de Vitivinicultura [INAVI]. (2021). Estadísticas de viñedos 2021: Datos nacionales. https://www.inavi.com.uy/uploads/vinedo/02b47681b115aafaf1cc5aefcacd581496ffe733.pdf</w:t>
+        <w:t xml:space="preserve">Infobae. (2023, 16 de noviembre). Brecha cambiaria: ir de turista a las termas en Uruguay cuesta 118% más caro que a las de Argentina. https://www.infobae.com/america/america-latina/2023/11/16/brecha-cambiaria-ir-de-turista-a-las-termas-en-uruguay-cuesta-118-mas-caro-que-a-las-de-argentina/</w:t>
       </w:r>
     </w:p>
     <w:p>
@@ -14519,7 +14559,7 @@
           <w:sz w:val="24"/>
           <w:szCs w:val="24"/>
         </w:rPr>
-        <w:t xml:space="preserve">Instituto Nacional de Vitivinicultura [INAVI]. (2023a). Estadísticas de viñedos 2023: Datos departamentales. https://www.inavi.com.uy/uploads/vinedo/bf1183c5ea6672b906da2100eda702efaff7be09.pdf</w:t>
+        <w:t xml:space="preserve">Instituto de Promoción de la Inversión y las Exportaciones de Bienes y Servicios [IMPO]. (2014). Ley N.º 19.253: Regulación de la actividad turística y declaratoria de interés nacional. https://www.impo.com.uy/bases/leyes/19253-2014</w:t>
       </w:r>
     </w:p>
     <w:p>
@@ -14539,7 +14579,7 @@
           <w:sz w:val="24"/>
           <w:szCs w:val="24"/>
         </w:rPr>
-        <w:t xml:space="preserve">Instituto Nacional de Vitivinicultura [INAVI]. (2023b). Estadísticas de viñedos 2023: Datos nacionales. https://www.inavi.com.uy/uploads/vinedo/b001699f9585532cfd1fa06a35756544f917eda5.pdf</w:t>
+        <w:t xml:space="preserve">Instituto Nacional de Vitivinicultura [INAVI] &amp; Opción Consultores. (2023). Estudio consolidado de la actividad económica e impacto del enoturismo en Uruguay. INAVI.</w:t>
       </w:r>
     </w:p>
     <w:p>
@@ -14559,7 +14599,7 @@
           <w:sz w:val="24"/>
           <w:szCs w:val="24"/>
         </w:rPr>
-        <w:t xml:space="preserve">Instituto Nacional de Vitivinicultura [INAVI]. (2024a). Plan Operativo Anual (POA) 2024/2025 y Registro Catastral de Variedades de Vid de Uruguay.</w:t>
+        <w:t xml:space="preserve">Instituto Nacional de Vitivinicultura [INAVI]. (2021). Estadísticas de viñedos 2021: Datos nacionales. https://www.inavi.com.uy/uploads/vinedo/02b47681b115aafaf1cc5aefcacd581496ffe733.pdf</w:t>
       </w:r>
     </w:p>
     <w:p>
@@ -14579,7 +14619,7 @@
           <w:sz w:val="24"/>
           <w:szCs w:val="24"/>
         </w:rPr>
-        <w:t xml:space="preserve">Instituto Nacional de Vitivinicultura [INAVI]. (2024b). Reporte INAVI 2024. https://www.inavi.com.uy/uploads/vinedo/346bb91b94f57f26d3e293b52fc0059a83b273cf.pdf</w:t>
+        <w:t xml:space="preserve">Instituto Nacional de Vitivinicultura [INAVI]. (2023a). Estadísticas de viñedos 2023: Datos departamentales. https://www.inavi.com.uy/uploads/vinedo/bf1183c5ea6672b906da2100eda702efaff7be09.pdf</w:t>
       </w:r>
     </w:p>
     <w:p>
@@ -14599,7 +14639,7 @@
           <w:sz w:val="24"/>
           <w:szCs w:val="24"/>
         </w:rPr>
-        <w:t xml:space="preserve">Instituto Nacional de Vitivinicultura [INAVI]. (s.f.-a). Bertolini y Broglio. https://www.inavi.com.uy/bodega/bertolini-y-broglio/</w:t>
+        <w:t xml:space="preserve">Instituto Nacional de Vitivinicultura [INAVI]. (2023b). Estadísticas de viñedos 2023: Datos nacionales. https://www.inavi.com.uy/uploads/vinedo/b001699f9585532cfd1fa06a35756544f917eda5.pdf</w:t>
       </w:r>
     </w:p>
     <w:p>
@@ -14619,7 +14659,7 @@
           <w:sz w:val="24"/>
           <w:szCs w:val="24"/>
         </w:rPr>
-        <w:t xml:space="preserve">Instituto Nacional de Vitivinicultura [INAVI]. (s.f.-b). Bodega Salto Chico - Los Calos Ltda. https://www.inavi.com.uy/bodega/bodega-salto-chico/</w:t>
+        <w:t xml:space="preserve">Instituto Nacional de Vitivinicultura [INAVI]. (2024a). Plan Operativo Anual (POA) 2024/2025 y Registro Catastral de Variedades de Vid de Uruguay.</w:t>
       </w:r>
     </w:p>
     <w:p>
@@ -14639,7 +14679,7 @@
           <w:sz w:val="24"/>
           <w:szCs w:val="24"/>
         </w:rPr>
-        <w:t xml:space="preserve">Instituto Nacional de Vitivinicultura [INAVI]. (s.f.-c). Colonia - Enoturismo. https://www.inavi.com.uy/enoturismo/colonia/</w:t>
+        <w:t xml:space="preserve">Instituto Nacional de Vitivinicultura [INAVI]. (2024b). Reporte INAVI 2024. https://www.inavi.com.uy/uploads/vinedo/346bb91b94f57f26d3e293b52fc0059a83b273cf.pdf</w:t>
       </w:r>
     </w:p>
     <w:p>
@@ -14659,7 +14699,7 @@
           <w:sz w:val="24"/>
           <w:szCs w:val="24"/>
         </w:rPr>
-        <w:t xml:space="preserve">Instituto Nacional de Vitivinicultura [INAVI]. (s.f.-d). Enoturismo recibe USD 11 millones anuales. https://www.inavi.com.uy/noticia/enoturismo-recibe-usd-11-millones-anuales/</w:t>
+        <w:t xml:space="preserve">Instituto Nacional de Vitivinicultura [INAVI]. (s.f.-a). Bertolini y Broglio. https://www.inavi.com.uy/bodega/bertolini-y-broglio/</w:t>
       </w:r>
     </w:p>
     <w:p>
@@ -14679,7 +14719,7 @@
           <w:sz w:val="24"/>
           <w:szCs w:val="24"/>
         </w:rPr>
-        <w:t xml:space="preserve">Instituto Nacional de Vitivinicultura [INAVI]. (s.f.-e). Programa de Viticultura Sostenible. Vinos del Uruguay. https://www.vinosdeluruguay.com/programa-de-viticultura-sostenible/</w:t>
+        <w:t xml:space="preserve">Instituto Nacional de Vitivinicultura [INAVI]. (s.f.-b). Bodega Salto Chico - Los Calos Ltda. https://www.inavi.com.uy/bodega/bodega-salto-chico/</w:t>
       </w:r>
     </w:p>
     <w:p>
@@ -14699,7 +14739,7 @@
           <w:sz w:val="24"/>
           <w:szCs w:val="24"/>
         </w:rPr>
-        <w:t xml:space="preserve">Instituto Nacional de Vitivinicultura [INAVI]. (s.f.-f). Salto - Enoturismo. https://www.inavi.com.uy/enoturismo/salto/</w:t>
+        <w:t xml:space="preserve">Instituto Nacional de Vitivinicultura [INAVI]. (s.f.-c). Colonia - Enoturismo. https://www.inavi.com.uy/enoturismo/colonia/</w:t>
       </w:r>
     </w:p>
     <w:p>
@@ -14719,7 +14759,7 @@
           <w:sz w:val="24"/>
           <w:szCs w:val="24"/>
         </w:rPr>
-        <w:t xml:space="preserve">Intendencia de Salto. (s.f.-a). Bodegas. Turismo Salto. https://turismo.salto.gub.uy/sitios-de-interes/bodegas</w:t>
+        <w:t xml:space="preserve">Instituto Nacional de Vitivinicultura [INAVI]. (s.f.-d). Enoturismo recibe USD 11 millones anuales. https://www.inavi.com.uy/noticia/enoturismo-recibe-usd-11-millones-anuales/</w:t>
       </w:r>
     </w:p>
     <w:p>
@@ -14739,7 +14779,7 @@
           <w:sz w:val="24"/>
           <w:szCs w:val="24"/>
         </w:rPr>
-        <w:t xml:space="preserve">Intendencia de Salto. (s.f.-b). La Mesa Estratégica de Turismo de Salto apuesta al fortalecimiento del destino. https://www.salto.gub.uy/noticias/la-mesa-estrategica-de-turismo-de-salto-apuesta-al-fortalecimiento-del-destino</w:t>
+        <w:t xml:space="preserve">Instituto Nacional de Vitivinicultura [INAVI]. (s.f.-e). Programa de Viticultura Sostenible. Vinos del Uruguay. https://www.vinosdeluruguay.com/programa-de-viticultura-sostenible/</w:t>
       </w:r>
     </w:p>
     <w:p>
@@ -14759,7 +14799,7 @@
           <w:sz w:val="24"/>
           <w:szCs w:val="24"/>
         </w:rPr>
-        <w:t xml:space="preserve">Intendencia de Salto. (s.f.-c). Nuevas acciones dentro del proceso de rescate de la Bodega Harriague. https://salto.gub.uy/noticias/nuevas-acciones-dentro-del-proceso-de-rescate-de-la-bodega-harriague</w:t>
+        <w:t xml:space="preserve">Instituto Nacional de Vitivinicultura [INAVI]. (s.f.-f). Salto - Enoturismo. https://www.inavi.com.uy/enoturismo/salto/</w:t>
       </w:r>
     </w:p>
     <w:p>
@@ -14779,7 +14819,7 @@
           <w:sz w:val="24"/>
           <w:szCs w:val="24"/>
         </w:rPr>
-        <w:t xml:space="preserve">Intendencia de Salto. (s.f.-d). Termal. Turismo Salto. https://turismo.salto.gub.uy/termal</w:t>
+        <w:t xml:space="preserve">Intendencia de Salto. (s.f.-a). Bodegas. Turismo Salto. https://turismo.salto.gub.uy/sitios-de-interes/bodegas</w:t>
       </w:r>
     </w:p>
     <w:p>
@@ -14799,7 +14839,7 @@
           <w:sz w:val="24"/>
           <w:szCs w:val="24"/>
         </w:rPr>
-        <w:t xml:space="preserve">La Hora del Campo. (s.f.). Tres vinos del «terroir salteño» ganaron una «Medalla de Oro». https://lahoradelcampo.com.uy/site/tres-vinos-del-terroir-salteno-ganaron-una-medalla-de-oro/</w:t>
+        <w:t xml:space="preserve">Intendencia de Salto. (s.f.-b). La Mesa Estratégica de Turismo de Salto apuesta al fortalecimiento del destino. https://www.salto.gub.uy/noticias/la-mesa-estrategica-de-turismo-de-salto-apuesta-al-fortalecimiento-del-destino</w:t>
       </w:r>
     </w:p>
     <w:p>
@@ -14819,7 +14859,7 @@
           <w:sz w:val="24"/>
           <w:szCs w:val="24"/>
         </w:rPr>
-        <w:t xml:space="preserve">La Sacristía. (s.f.). Bertolini &amp; Broglio Viognier. https://lasacristia.com.uy/catalogo/bertolini-broglio-viognier_7730951970161_7730951970161</w:t>
+        <w:t xml:space="preserve">Intendencia de Salto. (s.f.-c). Nuevas acciones dentro del proceso de rescate de la Bodega Harriague. https://salto.gub.uy/noticias/nuevas-acciones-dentro-del-proceso-de-rescate-de-la-bodega-harriague</w:t>
       </w:r>
     </w:p>
     <w:p>
@@ -14839,7 +14879,7 @@
           <w:sz w:val="24"/>
           <w:szCs w:val="24"/>
         </w:rPr>
-        <w:t xml:space="preserve">Maslow, A. H. (1964). Religions, values, and peak-experiences. Ohio State University Press.</w:t>
+        <w:t xml:space="preserve">Intendencia de Salto. (s.f.-d). Termal. Turismo Salto. https://turismo.salto.gub.uy/termal</w:t>
       </w:r>
     </w:p>
     <w:p>
@@ -14859,7 +14899,7 @@
           <w:sz w:val="24"/>
           <w:szCs w:val="24"/>
         </w:rPr>
-        <w:t xml:space="preserve">Ministerio de Ganadería, Agricultura y Pesca [MGAP]. (2024). Programa de Viticultura Sostenible INAVI. https://descargas.mgap.gub.uy/OPYPA/Anuarios/Anuarioopypa2024/TP/11/TP11web/TP11-ProgramadeViticulturaSostenible.pdf</w:t>
+        <w:t xml:space="preserve">La Hora del Campo. (s.f.). Tres vinos del «terroir salteño» ganaron una «Medalla de Oro». https://lahoradelcampo.com.uy/site/tres-vinos-del-terroir-salteno-ganaron-una-medalla-de-oro/</w:t>
       </w:r>
     </w:p>
     <w:p>
@@ -14879,7 +14919,7 @@
           <w:sz w:val="24"/>
           <w:szCs w:val="24"/>
         </w:rPr>
-        <w:t xml:space="preserve">Ministerio de Turismo de Uruguay. (2025a). Turismo emisivo: Cuarto trimestre 2024. Observatorio de Turismo Inteligente. https://www.gub.uy/ministerio-turismo/sites/ministerio-turismo/files/2025-01/E4T2024.pdf</w:t>
+        <w:t xml:space="preserve">La Sacristía. (s.f.). Bertolini &amp; Broglio Viognier. https://lasacristia.com.uy/catalogo/bertolini-broglio-viognier_7730951970161_7730951970161</w:t>
       </w:r>
     </w:p>
     <w:p>
@@ -14899,7 +14939,7 @@
           <w:sz w:val="24"/>
           <w:szCs w:val="24"/>
         </w:rPr>
-        <w:t xml:space="preserve">Ministerio de Turismo de Uruguay. (2025b). Turismo emisivo: Primer trimestre 2025. Observatorio de Turismo Inteligente. https://www.gub.uy/ministerio-turismo/sites/ministerio-turismo/files/2025-06/E-1T2025.pdf</w:t>
+        <w:t xml:space="preserve">Maslow, A. H. (1964). Religions, values, and peak-experiences. Ohio State University Press.</w:t>
       </w:r>
     </w:p>
     <w:p>
@@ -14919,7 +14959,7 @@
           <w:sz w:val="24"/>
           <w:szCs w:val="24"/>
         </w:rPr>
-        <w:t xml:space="preserve">Ministerio de Turismo de Uruguay. (2025c). Turismo emisivo: Tercer trimestre 2025. Observatorio de Turismo Inteligente. https://www.gub.uy/ministerio-turismo/sites/ministerio-turismo/files/2025-10/E3T25.pdf</w:t>
+        <w:t xml:space="preserve">Ministerio de Ganadería, Agricultura y Pesca [MGAP]. (2024). Programa de Viticultura Sostenible INAVI. https://descargas.mgap.gub.uy/OPYPA/Anuarios/Anuarioopypa2024/TP/11/TP11web/TP11-ProgramadeViticulturaSostenible.pdf</w:t>
       </w:r>
     </w:p>
     <w:p>
@@ -14939,7 +14979,7 @@
           <w:sz w:val="24"/>
           <w:szCs w:val="24"/>
         </w:rPr>
-        <w:t xml:space="preserve">Ministerio de Turismo de Uruguay. (s.f.-a). Destino Termas. https://destinotermas.gub.uy/</w:t>
+        <w:t xml:space="preserve">Ministerio de Turismo de Uruguay. (2025a). Turismo emisivo: Cuarto trimestre 2024. Observatorio de Turismo Inteligente. https://www.gub.uy/ministerio-turismo/sites/ministerio-turismo/files/2025-01/E4T2024.pdf</w:t>
       </w:r>
     </w:p>
     <w:p>
@@ -14959,7 +14999,7 @@
           <w:sz w:val="24"/>
           <w:szCs w:val="24"/>
         </w:rPr>
-        <w:t xml:space="preserve">Ministerio de Turismo de Uruguay. (s.f.-b). Descubrir la tierra del Tannat, piedras preciosas y termas. Uruguay Natural. https://uruguaynatural.com/es/experiences/descubrir-la-tierra-del-tannat-piedras-preciosas-y-termas/</w:t>
+        <w:t xml:space="preserve">Ministerio de Turismo de Uruguay. (2025b). Turismo emisivo: Primer trimestre 2025. Observatorio de Turismo Inteligente. https://www.gub.uy/ministerio-turismo/sites/ministerio-turismo/files/2025-06/E-1T2025.pdf</w:t>
       </w:r>
     </w:p>
     <w:p>
@@ -14979,7 +15019,7 @@
           <w:sz w:val="24"/>
           <w:szCs w:val="24"/>
         </w:rPr>
-        <w:t xml:space="preserve">Ministerio de Turismo de Uruguay. (s.f.-c). Wine tourism guide / Guía de enoturismo. Uruguay Natural. https://uruguaynatural.com/wp-content/uploads/2023/02/Enoturismo_ESP-ING_7mar2019.pdf</w:t>
+        <w:t xml:space="preserve">Ministerio de Turismo de Uruguay. (2025c). Turismo emisivo: Tercer trimestre 2025. Observatorio de Turismo Inteligente. https://www.gub.uy/ministerio-turismo/sites/ministerio-turismo/files/2025-10/E3T25.pdf</w:t>
       </w:r>
     </w:p>
     <w:p>
@@ -14999,7 +15039,7 @@
           <w:sz w:val="24"/>
           <w:szCs w:val="24"/>
         </w:rPr>
-        <w:t xml:space="preserve">Montevideo.com. (s.f.). La brecha de precios entre Concordia y Salto creció a un 40%, según informe UC. https://www.montevideo.com.uy/Noticias/La-brecha-de-precios-entre-Concordia-y-Salto-crecio-a-un-40--segun-informe-uc954784</w:t>
+        <w:t xml:space="preserve">Ministerio de Turismo de Uruguay. (s.f.-a). Destino Termas. https://destinotermas.gub.uy/</w:t>
       </w:r>
     </w:p>
     <w:p>
@@ -15019,7 +15059,7 @@
           <w:sz w:val="24"/>
           <w:szCs w:val="24"/>
         </w:rPr>
-        <w:t xml:space="preserve">Observatorio Económico, Universidad Católica del Uruguay Campus Salto [UCU]. (2024). Indicador de Precios Fronterizos, septiembre 2024. https://www.ucu.edu.uy/Institucionales/INFORMES-uc1313/4676/SET-24-compressed.pdf</w:t>
+        <w:t xml:space="preserve">Ministerio de Turismo de Uruguay. (s.f.-b). Descubrir la tierra del Tannat, piedras preciosas y termas. Uruguay Natural. https://uruguaynatural.com/es/experiences/descubrir-la-tierra-del-tannat-piedras-preciosas-y-termas/</w:t>
       </w:r>
     </w:p>
     <w:p>
@@ -15039,7 +15079,7 @@
           <w:sz w:val="24"/>
           <w:szCs w:val="24"/>
         </w:rPr>
-        <w:t xml:space="preserve">Observatorio Económico, Universidad Católica del Uruguay Campus Salto [UCU]. (2025). Estudio del perfil del turista de la Región de Salto Grande.</w:t>
+        <w:t xml:space="preserve">Ministerio de Turismo de Uruguay. (s.f.-c). Wine tourism guide / Guía de enoturismo. Uruguay Natural. https://uruguaynatural.com/wp-content/uploads/2023/02/Enoturismo_ESP-ING_7mar2019.pdf</w:t>
       </w:r>
     </w:p>
     <w:p>
@@ -15059,7 +15099,7 @@
           <w:sz w:val="24"/>
           <w:szCs w:val="24"/>
         </w:rPr>
-        <w:t xml:space="preserve">Oficina de Planeamiento y Presupuesto [OPP]. (s.f.). Programa vial departamental: Salto. https://www.opp.gub.uy/sites/default/files/inline-files/PVD_SALTO.pdf</w:t>
+        <w:t xml:space="preserve">Montevideo.com. (s.f.). La brecha de precios entre Concordia y Salto creció a un 40%, según informe UC. https://www.montevideo.com.uy/Noticias/La-brecha-de-precios-entre-Concordia-y-Salto-crecio-a-un-40--segun-informe-uc954784</w:t>
       </w:r>
     </w:p>
     <w:p>
@@ -15079,7 +15119,7 @@
           <w:sz w:val="24"/>
           <w:szCs w:val="24"/>
         </w:rPr>
-        <w:t xml:space="preserve">Organización Mundial del Turismo [ONU Turismo]. (s.f.). Desarrollo sostenible. https://www.untourism.int/sustainable-development</w:t>
+        <w:t xml:space="preserve">Observatorio Económico, Universidad Católica del Uruguay Campus Salto [UCU]. (2024). Indicador de Precios Fronterizos, septiembre 2024. https://www.ucu.edu.uy/Institucionales/INFORMES-uc1313/4676/SET-24-compressed.pdf</w:t>
       </w:r>
     </w:p>
     <w:p>
@@ -15099,7 +15139,7 @@
           <w:sz w:val="24"/>
           <w:szCs w:val="24"/>
         </w:rPr>
-        <w:t xml:space="preserve">Pasaporte Uruguay. (s.f.). Enoturismo uruguayo recaudó 11 millones de dólares en 2022, informó INAVI. https://pasaporteuruguay.com/turismo/7630-enoturismo-uruguayo-recaudo-11-millones-de-dolares-en-2022-informo-inavi</w:t>
+        <w:t xml:space="preserve">Observatorio Económico, Universidad Católica del Uruguay Campus Salto [UCU]. (2025). Estudio del perfil del turista de la Región de Salto Grande.</w:t>
       </w:r>
     </w:p>
     <w:p>
@@ -15119,7 +15159,7 @@
           <w:sz w:val="24"/>
           <w:szCs w:val="24"/>
         </w:rPr>
-        <w:t xml:space="preserve">Pine, B. J., &amp; Gilmore, J. H. (1998). Welcome to the experience economy. Harvard Business Review, 76(4), 97–105.</w:t>
+        <w:t xml:space="preserve">Oficina de Planeamiento y Presupuesto [OPP]. (s.f.). Programa vial departamental: Salto. https://www.opp.gub.uy/sites/default/files/inline-files/PVD_SALTO.pdf</w:t>
       </w:r>
     </w:p>
     <w:p>
@@ -15139,7 +15179,7 @@
           <w:sz w:val="24"/>
           <w:szCs w:val="24"/>
         </w:rPr>
-        <w:t xml:space="preserve">Playa Escondida. (s.f.). Enoturismo y la ruta del vino en Canelones. https://playaescondida.uy/blog/enoturismo-y-ruta-del-vino-canelones-uruguay/</w:t>
+        <w:t xml:space="preserve">Organización Mundial del Turismo [ONU Turismo]. (s.f.). Desarrollo sostenible. https://www.untourism.int/sustainable-development</w:t>
       </w:r>
     </w:p>
     <w:p>
@@ -15159,7 +15199,87 @@
           <w:sz w:val="24"/>
           <w:szCs w:val="24"/>
         </w:rPr>
+        <w:t xml:space="preserve">Pasaporte Uruguay. (s.f.). Enoturismo uruguayo recaudó 11 millones de dólares en 2022, informó INAVI. https://pasaporteuruguay.com/turismo/7630-enoturismo-uruguayo-recaudo-11-millones-de-dolares-en-2022-informo-inavi</w:t>
+      </w:r>
+    </w:p>
+    <w:p>
+      <w:pPr>
+        <w:spacing w:after="160" w:line="240" w:lineRule="auto"/>
+        <w:ind w:left="720" w:hanging="720"/>
+        <w:jc w:val="left"/>
+      </w:pPr>
+      <w:r>
+        <w:rPr>
+          <w:rFonts w:ascii="Arial" w:cs="Arial" w:eastAsia="Arial" w:hAnsi="Arial"/>
+          <w:b w:val="false"/>
+          <w:bCs w:val="false"/>
+          <w:i w:val="false"/>
+          <w:iCs w:val="false"/>
+          <w:color w:val="000000"/>
+          <w:sz w:val="24"/>
+          <w:szCs w:val="24"/>
+        </w:rPr>
+        <w:t xml:space="preserve">Pine, B. J., &amp; Gilmore, J. H. (1998). Welcome to the experience economy. Harvard Business Review, 76(4), 97–105.</w:t>
+      </w:r>
+    </w:p>
+    <w:p>
+      <w:pPr>
+        <w:spacing w:after="160" w:line="240" w:lineRule="auto"/>
+        <w:ind w:left="720" w:hanging="720"/>
+        <w:jc w:val="left"/>
+      </w:pPr>
+      <w:r>
+        <w:rPr>
+          <w:rFonts w:ascii="Arial" w:cs="Arial" w:eastAsia="Arial" w:hAnsi="Arial"/>
+          <w:b w:val="false"/>
+          <w:bCs w:val="false"/>
+          <w:i w:val="false"/>
+          <w:iCs w:val="false"/>
+          <w:color w:val="000000"/>
+          <w:sz w:val="24"/>
+          <w:szCs w:val="24"/>
+        </w:rPr>
+        <w:t xml:space="preserve">Playa Escondida. (s.f.). Enoturismo y la ruta del vino en Canelones. https://playaescondida.uy/blog/enoturismo-y-ruta-del-vino-canelones-uruguay/</w:t>
+      </w:r>
+    </w:p>
+    <w:p>
+      <w:pPr>
+        <w:spacing w:after="160" w:line="240" w:lineRule="auto"/>
+        <w:ind w:left="720" w:hanging="720"/>
+        <w:jc w:val="left"/>
+      </w:pPr>
+      <w:r>
+        <w:rPr>
+          <w:rFonts w:ascii="Arial" w:cs="Arial" w:eastAsia="Arial" w:hAnsi="Arial"/>
+          <w:b w:val="false"/>
+          <w:bCs w:val="false"/>
+          <w:i w:val="false"/>
+          <w:iCs w:val="false"/>
+          <w:color w:val="000000"/>
+          <w:sz w:val="24"/>
+          <w:szCs w:val="24"/>
+        </w:rPr>
         <w:t xml:space="preserve">Por las Catas. (2018). Bodega Bertolini &amp; Broglio. De Salto vienen los mejores vinos uruguayos. http://porlascatas.blogspot.com/2018/03/bodega-bertolini-y-broglio-de-salto.html</w:t>
+      </w:r>
+    </w:p>
+    <w:p>
+      <w:pPr>
+        <w:spacing w:after="160" w:line="240" w:lineRule="auto"/>
+        <w:ind w:left="720" w:hanging="720"/>
+        <w:jc w:val="left"/>
+      </w:pPr>
+      <w:r>
+        <w:rPr>
+          <w:rFonts w:ascii="Arial" w:cs="Arial" w:eastAsia="Arial" w:hAnsi="Arial"/>
+          <w:b w:val="false"/>
+          <w:bCs w:val="false"/>
+          <w:i w:val="false"/>
+          <w:iCs w:val="false"/>
+          <w:color w:val="000000"/>
+          <w:sz w:val="24"/>
+          <w:szCs w:val="24"/>
+        </w:rPr>
+        <w:t xml:space="preserve">Prats, L. (1997). Antropología y patrimonio. Ariel.</w:t>
       </w:r>
     </w:p>
     <w:p>

</xml_diff>

<commit_message>
Fix inverted tourism data in Tabla 4 (Oportunidades)
The table was sourced from MINTUR's "Turismo Emisivo" quarterly
reports, which measure Uruguayan residents' spending while traveling
TO Brazil/Argentina/Chile -- the opposite of what the surrounding
argument needs (foreign visitors' spending while visiting Uruguay).
Verified by downloading and text-extracting the actual cited PDF.

Replaced with real "Turismo Receptivo" data for the three most recent
published quarters (Q4 2025, Q1 2026, Q2 2026), which now correctly
and even more strongly supports the "Brazil = highest-spending market"
argument (Brazil leads per-day spend in all three quarters). Updated
the three MINTUR reference entries accordingly.

Co-Authored-By: Claude Sonnet 5 <noreply@anthropic.com>
</commit_message>
<xml_diff>
--- a/La Ruta del Tannat - Proyecto Final.docx
+++ b/La Ruta del Tannat - Proyecto Final.docx
@@ -5152,7 +5152,7 @@
           <w:sz w:val="24"/>
           <w:szCs w:val="24"/>
         </w:rPr>
-        <w:t xml:space="preserve">La principal oportunidad identificada es la atracción del mercado enoturístico de Brasil, de alta rentabilidad y afinidad con el sector, tal como reflejan los datos trimestrales del Observatorio de Turismo Inteligente del MINTUR:</w:t>
+        <w:t xml:space="preserve">La principal oportunidad identificada es la atracción del mercado enoturístico de Brasil, de alta rentabilidad y afinidad con el sector: según los informes de Turismo Receptivo del Observatorio de Turismo Inteligente del MINTUR, el turista brasileño que visita Uruguay presenta sistemáticamente el mayor gasto diario per cápita de los tres mercados regionales de referencia:</w:t>
       </w:r>
     </w:p>
     <w:p>
@@ -5192,7 +5192,7 @@
           <w:sz w:val="24"/>
           <w:szCs w:val="24"/>
         </w:rPr>
-        <w:t xml:space="preserve">Gasto y estadía promedio de turistas extranjeros por trimestre, según mercado de origen</w:t>
+        <w:t xml:space="preserve">Gasto diario y estadía promedio de los visitantes de Brasil, Argentina y Chile en Uruguay, por trimestre</w:t>
       </w:r>
     </w:p>
     <w:tbl>
@@ -5208,10 +5208,10 @@
         </w:tblBorders>
       </w:tblPr>
       <w:tblGrid>
-        <w:gridCol w:w="1816"/>
-        <w:gridCol w:w="2229"/>
-        <w:gridCol w:w="2229"/>
-        <w:gridCol w:w="2229"/>
+        <w:gridCol w:w="2955"/>
+        <w:gridCol w:w="1874"/>
+        <w:gridCol w:w="1802"/>
+        <w:gridCol w:w="1874"/>
       </w:tblGrid>
       <w:tr>
         <w:trPr>
@@ -5219,7 +5219,7 @@
         </w:trPr>
         <w:tc>
           <w:tcPr>
-            <w:tcW w:type="dxa" w:w="1816"/>
+            <w:tcW w:type="dxa" w:w="2955"/>
             <w:shd w:fill="5b2333" w:val="clear"/>
             <w:tcMar>
               <w:top w:type="dxa" w:w="60"/>
@@ -5245,13 +5245,13 @@
                 <w:sz w:val="20"/>
                 <w:szCs w:val="20"/>
               </w:rPr>
-              <w:t xml:space="preserve">Trimestre (MINTUR)</w:t>
-            </w:r>
-          </w:p>
-        </w:tc>
-        <w:tc>
-          <w:tcPr>
-            <w:tcW w:type="dxa" w:w="2229"/>
+              <w:t xml:space="preserve">Trimestre (MINTUR, Turismo Receptivo)</w:t>
+            </w:r>
+          </w:p>
+        </w:tc>
+        <w:tc>
+          <w:tcPr>
+            <w:tcW w:type="dxa" w:w="1874"/>
             <w:shd w:fill="5b2333" w:val="clear"/>
             <w:tcMar>
               <w:top w:type="dxa" w:w="60"/>
@@ -5283,7 +5283,7 @@
         </w:tc>
         <w:tc>
           <w:tcPr>
-            <w:tcW w:type="dxa" w:w="2229"/>
+            <w:tcW w:type="dxa" w:w="1802"/>
             <w:shd w:fill="5b2333" w:val="clear"/>
             <w:tcMar>
               <w:top w:type="dxa" w:w="60"/>
@@ -5315,7 +5315,7 @@
         </w:tc>
         <w:tc>
           <w:tcPr>
-            <w:tcW w:type="dxa" w:w="2229"/>
+            <w:tcW w:type="dxa" w:w="1874"/>
             <w:shd w:fill="5b2333" w:val="clear"/>
             <w:tcMar>
               <w:top w:type="dxa" w:w="60"/>
@@ -5352,125 +5352,125 @@
         </w:trPr>
         <w:tc>
           <w:tcPr>
-            <w:tcW w:type="dxa" w:w="1816"/>
-            <w:tcMar>
-              <w:top w:type="dxa" w:w="60"/>
-              <w:left w:type="dxa" w:w="100"/>
-              <w:bottom w:type="dxa" w:w="60"/>
-              <w:right w:type="dxa" w:w="100"/>
-            </w:tcMar>
-            <w:vAlign w:val="center"/>
-          </w:tcPr>
-          <w:p>
-            <w:pPr>
-              <w:spacing w:line="240" w:lineRule="auto"/>
-              <w:jc w:val="center"/>
-            </w:pPr>
-            <w:r>
-              <w:rPr>
-                <w:rFonts w:ascii="Arial" w:cs="Arial" w:eastAsia="Arial" w:hAnsi="Arial"/>
-                <w:b w:val="false"/>
-                <w:bCs w:val="false"/>
-                <w:i w:val="false"/>
-                <w:iCs w:val="false"/>
-                <w:color w:val="000000"/>
-                <w:sz w:val="20"/>
-                <w:szCs w:val="20"/>
-              </w:rPr>
-              <w:t xml:space="preserve">3er trim. 2025</w:t>
-            </w:r>
-          </w:p>
-        </w:tc>
-        <w:tc>
-          <w:tcPr>
-            <w:tcW w:type="dxa" w:w="2229"/>
-            <w:tcMar>
-              <w:top w:type="dxa" w:w="60"/>
-              <w:left w:type="dxa" w:w="100"/>
-              <w:bottom w:type="dxa" w:w="60"/>
-              <w:right w:type="dxa" w:w="100"/>
-            </w:tcMar>
-            <w:vAlign w:val="center"/>
-          </w:tcPr>
-          <w:p>
-            <w:pPr>
-              <w:spacing w:line="240" w:lineRule="auto"/>
-              <w:jc w:val="center"/>
-            </w:pPr>
-            <w:r>
-              <w:rPr>
-                <w:rFonts w:ascii="Arial" w:cs="Arial" w:eastAsia="Arial" w:hAnsi="Arial"/>
-                <w:b w:val="false"/>
-                <w:bCs w:val="false"/>
-                <w:i w:val="false"/>
-                <w:iCs w:val="false"/>
-                <w:color w:val="000000"/>
-                <w:sz w:val="20"/>
-                <w:szCs w:val="20"/>
-              </w:rPr>
-              <w:t xml:space="preserve">Gasto USD 81,5 / 7,3 noches</w:t>
-            </w:r>
-          </w:p>
-        </w:tc>
-        <w:tc>
-          <w:tcPr>
-            <w:tcW w:type="dxa" w:w="2229"/>
-            <w:tcMar>
-              <w:top w:type="dxa" w:w="60"/>
-              <w:left w:type="dxa" w:w="100"/>
-              <w:bottom w:type="dxa" w:w="60"/>
-              <w:right w:type="dxa" w:w="100"/>
-            </w:tcMar>
-            <w:vAlign w:val="center"/>
-          </w:tcPr>
-          <w:p>
-            <w:pPr>
-              <w:spacing w:line="240" w:lineRule="auto"/>
-              <w:jc w:val="center"/>
-            </w:pPr>
-            <w:r>
-              <w:rPr>
-                <w:rFonts w:ascii="Arial" w:cs="Arial" w:eastAsia="Arial" w:hAnsi="Arial"/>
-                <w:b w:val="false"/>
-                <w:bCs w:val="false"/>
-                <w:i w:val="false"/>
-                <w:iCs w:val="false"/>
-                <w:color w:val="000000"/>
-                <w:sz w:val="20"/>
-                <w:szCs w:val="20"/>
-              </w:rPr>
-              <w:t xml:space="preserve">Gasto USD 79,7 / 4,6 noches</w:t>
-            </w:r>
-          </w:p>
-        </w:tc>
-        <w:tc>
-          <w:tcPr>
-            <w:tcW w:type="dxa" w:w="2229"/>
-            <w:tcMar>
-              <w:top w:type="dxa" w:w="60"/>
-              <w:left w:type="dxa" w:w="100"/>
-              <w:bottom w:type="dxa" w:w="60"/>
-              <w:right w:type="dxa" w:w="100"/>
-            </w:tcMar>
-            <w:vAlign w:val="center"/>
-          </w:tcPr>
-          <w:p>
-            <w:pPr>
-              <w:spacing w:line="240" w:lineRule="auto"/>
-              <w:jc w:val="center"/>
-            </w:pPr>
-            <w:r>
-              <w:rPr>
-                <w:rFonts w:ascii="Arial" w:cs="Arial" w:eastAsia="Arial" w:hAnsi="Arial"/>
-                <w:b w:val="false"/>
-                <w:bCs w:val="false"/>
-                <w:i w:val="false"/>
-                <w:iCs w:val="false"/>
-                <w:color w:val="000000"/>
-                <w:sz w:val="20"/>
-                <w:szCs w:val="20"/>
-              </w:rPr>
-              <w:t xml:space="preserve">Gasto USD 87,9 / 7,2 noches</w:t>
+            <w:tcW w:type="dxa" w:w="2955"/>
+            <w:tcMar>
+              <w:top w:type="dxa" w:w="60"/>
+              <w:left w:type="dxa" w:w="100"/>
+              <w:bottom w:type="dxa" w:w="60"/>
+              <w:right w:type="dxa" w:w="100"/>
+            </w:tcMar>
+            <w:vAlign w:val="center"/>
+          </w:tcPr>
+          <w:p>
+            <w:pPr>
+              <w:spacing w:line="240" w:lineRule="auto"/>
+              <w:jc w:val="center"/>
+            </w:pPr>
+            <w:r>
+              <w:rPr>
+                <w:rFonts w:ascii="Arial" w:cs="Arial" w:eastAsia="Arial" w:hAnsi="Arial"/>
+                <w:b w:val="false"/>
+                <w:bCs w:val="false"/>
+                <w:i w:val="false"/>
+                <w:iCs w:val="false"/>
+                <w:color w:val="000000"/>
+                <w:sz w:val="20"/>
+                <w:szCs w:val="20"/>
+              </w:rPr>
+              <w:t xml:space="preserve">2.º trim. 2026</w:t>
+            </w:r>
+          </w:p>
+        </w:tc>
+        <w:tc>
+          <w:tcPr>
+            <w:tcW w:type="dxa" w:w="1874"/>
+            <w:tcMar>
+              <w:top w:type="dxa" w:w="60"/>
+              <w:left w:type="dxa" w:w="100"/>
+              <w:bottom w:type="dxa" w:w="60"/>
+              <w:right w:type="dxa" w:w="100"/>
+            </w:tcMar>
+            <w:vAlign w:val="center"/>
+          </w:tcPr>
+          <w:p>
+            <w:pPr>
+              <w:spacing w:line="240" w:lineRule="auto"/>
+              <w:jc w:val="center"/>
+            </w:pPr>
+            <w:r>
+              <w:rPr>
+                <w:rFonts w:ascii="Arial" w:cs="Arial" w:eastAsia="Arial" w:hAnsi="Arial"/>
+                <w:b w:val="false"/>
+                <w:bCs w:val="false"/>
+                <w:i w:val="false"/>
+                <w:iCs w:val="false"/>
+                <w:color w:val="000000"/>
+                <w:sz w:val="20"/>
+                <w:szCs w:val="20"/>
+              </w:rPr>
+              <w:t xml:space="preserve">Gasto USD 122,6 / 5,1 días</w:t>
+            </w:r>
+          </w:p>
+        </w:tc>
+        <w:tc>
+          <w:tcPr>
+            <w:tcW w:type="dxa" w:w="1802"/>
+            <w:tcMar>
+              <w:top w:type="dxa" w:w="60"/>
+              <w:left w:type="dxa" w:w="100"/>
+              <w:bottom w:type="dxa" w:w="60"/>
+              <w:right w:type="dxa" w:w="100"/>
+            </w:tcMar>
+            <w:vAlign w:val="center"/>
+          </w:tcPr>
+          <w:p>
+            <w:pPr>
+              <w:spacing w:line="240" w:lineRule="auto"/>
+              <w:jc w:val="center"/>
+            </w:pPr>
+            <w:r>
+              <w:rPr>
+                <w:rFonts w:ascii="Arial" w:cs="Arial" w:eastAsia="Arial" w:hAnsi="Arial"/>
+                <w:b w:val="false"/>
+                <w:bCs w:val="false"/>
+                <w:i w:val="false"/>
+                <w:iCs w:val="false"/>
+                <w:color w:val="000000"/>
+                <w:sz w:val="20"/>
+                <w:szCs w:val="20"/>
+              </w:rPr>
+              <w:t xml:space="preserve">Gasto USD 96,0 / 4,6 días</w:t>
+            </w:r>
+          </w:p>
+        </w:tc>
+        <w:tc>
+          <w:tcPr>
+            <w:tcW w:type="dxa" w:w="1874"/>
+            <w:tcMar>
+              <w:top w:type="dxa" w:w="60"/>
+              <w:left w:type="dxa" w:w="100"/>
+              <w:bottom w:type="dxa" w:w="60"/>
+              <w:right w:type="dxa" w:w="100"/>
+            </w:tcMar>
+            <w:vAlign w:val="center"/>
+          </w:tcPr>
+          <w:p>
+            <w:pPr>
+              <w:spacing w:line="240" w:lineRule="auto"/>
+              <w:jc w:val="center"/>
+            </w:pPr>
+            <w:r>
+              <w:rPr>
+                <w:rFonts w:ascii="Arial" w:cs="Arial" w:eastAsia="Arial" w:hAnsi="Arial"/>
+                <w:b w:val="false"/>
+                <w:bCs w:val="false"/>
+                <w:i w:val="false"/>
+                <w:iCs w:val="false"/>
+                <w:color w:val="000000"/>
+                <w:sz w:val="20"/>
+                <w:szCs w:val="20"/>
+              </w:rPr>
+              <w:t xml:space="preserve">Gasto USD 112,4 / 4,9 días</w:t>
             </w:r>
           </w:p>
         </w:tc>
@@ -5481,125 +5481,125 @@
         </w:trPr>
         <w:tc>
           <w:tcPr>
-            <w:tcW w:type="dxa" w:w="1816"/>
-            <w:tcMar>
-              <w:top w:type="dxa" w:w="60"/>
-              <w:left w:type="dxa" w:w="100"/>
-              <w:bottom w:type="dxa" w:w="60"/>
-              <w:right w:type="dxa" w:w="100"/>
-            </w:tcMar>
-            <w:vAlign w:val="center"/>
-          </w:tcPr>
-          <w:p>
-            <w:pPr>
-              <w:spacing w:line="240" w:lineRule="auto"/>
-              <w:jc w:val="center"/>
-            </w:pPr>
-            <w:r>
-              <w:rPr>
-                <w:rFonts w:ascii="Arial" w:cs="Arial" w:eastAsia="Arial" w:hAnsi="Arial"/>
-                <w:b w:val="false"/>
-                <w:bCs w:val="false"/>
-                <w:i w:val="false"/>
-                <w:iCs w:val="false"/>
-                <w:color w:val="000000"/>
-                <w:sz w:val="20"/>
-                <w:szCs w:val="20"/>
-              </w:rPr>
-              <w:t xml:space="preserve">1er trim. 2025</w:t>
-            </w:r>
-          </w:p>
-        </w:tc>
-        <w:tc>
-          <w:tcPr>
-            <w:tcW w:type="dxa" w:w="2229"/>
-            <w:tcMar>
-              <w:top w:type="dxa" w:w="60"/>
-              <w:left w:type="dxa" w:w="100"/>
-              <w:bottom w:type="dxa" w:w="60"/>
-              <w:right w:type="dxa" w:w="100"/>
-            </w:tcMar>
-            <w:vAlign w:val="center"/>
-          </w:tcPr>
-          <w:p>
-            <w:pPr>
-              <w:spacing w:line="240" w:lineRule="auto"/>
-              <w:jc w:val="center"/>
-            </w:pPr>
-            <w:r>
-              <w:rPr>
-                <w:rFonts w:ascii="Arial" w:cs="Arial" w:eastAsia="Arial" w:hAnsi="Arial"/>
-                <w:b w:val="false"/>
-                <w:bCs w:val="false"/>
-                <w:i w:val="false"/>
-                <w:iCs w:val="false"/>
-                <w:color w:val="000000"/>
-                <w:sz w:val="20"/>
-                <w:szCs w:val="20"/>
-              </w:rPr>
-              <w:t xml:space="preserve">Gasto USD 61,1 / 8,7 noches</w:t>
-            </w:r>
-          </w:p>
-        </w:tc>
-        <w:tc>
-          <w:tcPr>
-            <w:tcW w:type="dxa" w:w="2229"/>
-            <w:tcMar>
-              <w:top w:type="dxa" w:w="60"/>
-              <w:left w:type="dxa" w:w="100"/>
-              <w:bottom w:type="dxa" w:w="60"/>
-              <w:right w:type="dxa" w:w="100"/>
-            </w:tcMar>
-            <w:vAlign w:val="center"/>
-          </w:tcPr>
-          <w:p>
-            <w:pPr>
-              <w:spacing w:line="240" w:lineRule="auto"/>
-              <w:jc w:val="center"/>
-            </w:pPr>
-            <w:r>
-              <w:rPr>
-                <w:rFonts w:ascii="Arial" w:cs="Arial" w:eastAsia="Arial" w:hAnsi="Arial"/>
-                <w:b w:val="false"/>
-                <w:bCs w:val="false"/>
-                <w:i w:val="false"/>
-                <w:iCs w:val="false"/>
-                <w:color w:val="000000"/>
-                <w:sz w:val="20"/>
-                <w:szCs w:val="20"/>
-              </w:rPr>
-              <w:t xml:space="preserve">Gasto USD 73,5 / 5,5 noches</w:t>
-            </w:r>
-          </w:p>
-        </w:tc>
-        <w:tc>
-          <w:tcPr>
-            <w:tcW w:type="dxa" w:w="2229"/>
-            <w:tcMar>
-              <w:top w:type="dxa" w:w="60"/>
-              <w:left w:type="dxa" w:w="100"/>
-              <w:bottom w:type="dxa" w:w="60"/>
-              <w:right w:type="dxa" w:w="100"/>
-            </w:tcMar>
-            <w:vAlign w:val="center"/>
-          </w:tcPr>
-          <w:p>
-            <w:pPr>
-              <w:spacing w:line="240" w:lineRule="auto"/>
-              <w:jc w:val="center"/>
-            </w:pPr>
-            <w:r>
-              <w:rPr>
-                <w:rFonts w:ascii="Arial" w:cs="Arial" w:eastAsia="Arial" w:hAnsi="Arial"/>
-                <w:b w:val="false"/>
-                <w:bCs w:val="false"/>
-                <w:i w:val="false"/>
-                <w:iCs w:val="false"/>
-                <w:color w:val="000000"/>
-                <w:sz w:val="20"/>
-                <w:szCs w:val="20"/>
-              </w:rPr>
-              <w:t xml:space="preserve">Gasto USD 94,5 / 6,6 noches</w:t>
+            <w:tcW w:type="dxa" w:w="2955"/>
+            <w:tcMar>
+              <w:top w:type="dxa" w:w="60"/>
+              <w:left w:type="dxa" w:w="100"/>
+              <w:bottom w:type="dxa" w:w="60"/>
+              <w:right w:type="dxa" w:w="100"/>
+            </w:tcMar>
+            <w:vAlign w:val="center"/>
+          </w:tcPr>
+          <w:p>
+            <w:pPr>
+              <w:spacing w:line="240" w:lineRule="auto"/>
+              <w:jc w:val="center"/>
+            </w:pPr>
+            <w:r>
+              <w:rPr>
+                <w:rFonts w:ascii="Arial" w:cs="Arial" w:eastAsia="Arial" w:hAnsi="Arial"/>
+                <w:b w:val="false"/>
+                <w:bCs w:val="false"/>
+                <w:i w:val="false"/>
+                <w:iCs w:val="false"/>
+                <w:color w:val="000000"/>
+                <w:sz w:val="20"/>
+                <w:szCs w:val="20"/>
+              </w:rPr>
+              <w:t xml:space="preserve">1.º trim. 2026</w:t>
+            </w:r>
+          </w:p>
+        </w:tc>
+        <w:tc>
+          <w:tcPr>
+            <w:tcW w:type="dxa" w:w="1874"/>
+            <w:tcMar>
+              <w:top w:type="dxa" w:w="60"/>
+              <w:left w:type="dxa" w:w="100"/>
+              <w:bottom w:type="dxa" w:w="60"/>
+              <w:right w:type="dxa" w:w="100"/>
+            </w:tcMar>
+            <w:vAlign w:val="center"/>
+          </w:tcPr>
+          <w:p>
+            <w:pPr>
+              <w:spacing w:line="240" w:lineRule="auto"/>
+              <w:jc w:val="center"/>
+            </w:pPr>
+            <w:r>
+              <w:rPr>
+                <w:rFonts w:ascii="Arial" w:cs="Arial" w:eastAsia="Arial" w:hAnsi="Arial"/>
+                <w:b w:val="false"/>
+                <w:bCs w:val="false"/>
+                <w:i w:val="false"/>
+                <w:iCs w:val="false"/>
+                <w:color w:val="000000"/>
+                <w:sz w:val="20"/>
+                <w:szCs w:val="20"/>
+              </w:rPr>
+              <w:t xml:space="preserve">Gasto USD 112,1 / 7,3 días</w:t>
+            </w:r>
+          </w:p>
+        </w:tc>
+        <w:tc>
+          <w:tcPr>
+            <w:tcW w:type="dxa" w:w="1802"/>
+            <w:tcMar>
+              <w:top w:type="dxa" w:w="60"/>
+              <w:left w:type="dxa" w:w="100"/>
+              <w:bottom w:type="dxa" w:w="60"/>
+              <w:right w:type="dxa" w:w="100"/>
+            </w:tcMar>
+            <w:vAlign w:val="center"/>
+          </w:tcPr>
+          <w:p>
+            <w:pPr>
+              <w:spacing w:line="240" w:lineRule="auto"/>
+              <w:jc w:val="center"/>
+            </w:pPr>
+            <w:r>
+              <w:rPr>
+                <w:rFonts w:ascii="Arial" w:cs="Arial" w:eastAsia="Arial" w:hAnsi="Arial"/>
+                <w:b w:val="false"/>
+                <w:bCs w:val="false"/>
+                <w:i w:val="false"/>
+                <w:iCs w:val="false"/>
+                <w:color w:val="000000"/>
+                <w:sz w:val="20"/>
+                <w:szCs w:val="20"/>
+              </w:rPr>
+              <w:t xml:space="preserve">Gasto USD 88,2 / 7,6 días</w:t>
+            </w:r>
+          </w:p>
+        </w:tc>
+        <w:tc>
+          <w:tcPr>
+            <w:tcW w:type="dxa" w:w="1874"/>
+            <w:tcMar>
+              <w:top w:type="dxa" w:w="60"/>
+              <w:left w:type="dxa" w:w="100"/>
+              <w:bottom w:type="dxa" w:w="60"/>
+              <w:right w:type="dxa" w:w="100"/>
+            </w:tcMar>
+            <w:vAlign w:val="center"/>
+          </w:tcPr>
+          <w:p>
+            <w:pPr>
+              <w:spacing w:line="240" w:lineRule="auto"/>
+              <w:jc w:val="center"/>
+            </w:pPr>
+            <w:r>
+              <w:rPr>
+                <w:rFonts w:ascii="Arial" w:cs="Arial" w:eastAsia="Arial" w:hAnsi="Arial"/>
+                <w:b w:val="false"/>
+                <w:bCs w:val="false"/>
+                <w:i w:val="false"/>
+                <w:iCs w:val="false"/>
+                <w:color w:val="000000"/>
+                <w:sz w:val="20"/>
+                <w:szCs w:val="20"/>
+              </w:rPr>
+              <w:t xml:space="preserve">Gasto USD 122,1 / 7,6 días</w:t>
             </w:r>
           </w:p>
         </w:tc>
@@ -5610,125 +5610,125 @@
         </w:trPr>
         <w:tc>
           <w:tcPr>
-            <w:tcW w:type="dxa" w:w="1816"/>
-            <w:tcMar>
-              <w:top w:type="dxa" w:w="60"/>
-              <w:left w:type="dxa" w:w="100"/>
-              <w:bottom w:type="dxa" w:w="60"/>
-              <w:right w:type="dxa" w:w="100"/>
-            </w:tcMar>
-            <w:vAlign w:val="center"/>
-          </w:tcPr>
-          <w:p>
-            <w:pPr>
-              <w:spacing w:line="240" w:lineRule="auto"/>
-              <w:jc w:val="center"/>
-            </w:pPr>
-            <w:r>
-              <w:rPr>
-                <w:rFonts w:ascii="Arial" w:cs="Arial" w:eastAsia="Arial" w:hAnsi="Arial"/>
-                <w:b w:val="false"/>
-                <w:bCs w:val="false"/>
-                <w:i w:val="false"/>
-                <w:iCs w:val="false"/>
-                <w:color w:val="000000"/>
-                <w:sz w:val="20"/>
-                <w:szCs w:val="20"/>
-              </w:rPr>
-              <w:t xml:space="preserve">4to trim. 2024</w:t>
-            </w:r>
-          </w:p>
-        </w:tc>
-        <w:tc>
-          <w:tcPr>
-            <w:tcW w:type="dxa" w:w="2229"/>
-            <w:tcMar>
-              <w:top w:type="dxa" w:w="60"/>
-              <w:left w:type="dxa" w:w="100"/>
-              <w:bottom w:type="dxa" w:w="60"/>
-              <w:right w:type="dxa" w:w="100"/>
-            </w:tcMar>
-            <w:vAlign w:val="center"/>
-          </w:tcPr>
-          <w:p>
-            <w:pPr>
-              <w:spacing w:line="240" w:lineRule="auto"/>
-              <w:jc w:val="center"/>
-            </w:pPr>
-            <w:r>
-              <w:rPr>
-                <w:rFonts w:ascii="Arial" w:cs="Arial" w:eastAsia="Arial" w:hAnsi="Arial"/>
-                <w:b w:val="false"/>
-                <w:bCs w:val="false"/>
-                <w:i w:val="false"/>
-                <w:iCs w:val="false"/>
-                <w:color w:val="000000"/>
-                <w:sz w:val="20"/>
-                <w:szCs w:val="20"/>
-              </w:rPr>
-              <w:t xml:space="preserve">Gasto USD 74,9 / 7,2 noches</w:t>
-            </w:r>
-          </w:p>
-        </w:tc>
-        <w:tc>
-          <w:tcPr>
-            <w:tcW w:type="dxa" w:w="2229"/>
-            <w:tcMar>
-              <w:top w:type="dxa" w:w="60"/>
-              <w:left w:type="dxa" w:w="100"/>
-              <w:bottom w:type="dxa" w:w="60"/>
-              <w:right w:type="dxa" w:w="100"/>
-            </w:tcMar>
-            <w:vAlign w:val="center"/>
-          </w:tcPr>
-          <w:p>
-            <w:pPr>
-              <w:spacing w:line="240" w:lineRule="auto"/>
-              <w:jc w:val="center"/>
-            </w:pPr>
-            <w:r>
-              <w:rPr>
-                <w:rFonts w:ascii="Arial" w:cs="Arial" w:eastAsia="Arial" w:hAnsi="Arial"/>
-                <w:b w:val="false"/>
-                <w:bCs w:val="false"/>
-                <w:i w:val="false"/>
-                <w:iCs w:val="false"/>
-                <w:color w:val="000000"/>
-                <w:sz w:val="20"/>
-                <w:szCs w:val="20"/>
-              </w:rPr>
-              <w:t xml:space="preserve">Gasto USD 77,5 / 4,7 noches</w:t>
-            </w:r>
-          </w:p>
-        </w:tc>
-        <w:tc>
-          <w:tcPr>
-            <w:tcW w:type="dxa" w:w="2229"/>
-            <w:tcMar>
-              <w:top w:type="dxa" w:w="60"/>
-              <w:left w:type="dxa" w:w="100"/>
-              <w:bottom w:type="dxa" w:w="60"/>
-              <w:right w:type="dxa" w:w="100"/>
-            </w:tcMar>
-            <w:vAlign w:val="center"/>
-          </w:tcPr>
-          <w:p>
-            <w:pPr>
-              <w:spacing w:line="240" w:lineRule="auto"/>
-              <w:jc w:val="center"/>
-            </w:pPr>
-            <w:r>
-              <w:rPr>
-                <w:rFonts w:ascii="Arial" w:cs="Arial" w:eastAsia="Arial" w:hAnsi="Arial"/>
-                <w:b w:val="false"/>
-                <w:bCs w:val="false"/>
-                <w:i w:val="false"/>
-                <w:iCs w:val="false"/>
-                <w:color w:val="000000"/>
-                <w:sz w:val="20"/>
-                <w:szCs w:val="20"/>
-              </w:rPr>
-              <w:t xml:space="preserve">Gasto USD 78,4 / 7,3 noches</w:t>
+            <w:tcW w:type="dxa" w:w="2955"/>
+            <w:tcMar>
+              <w:top w:type="dxa" w:w="60"/>
+              <w:left w:type="dxa" w:w="100"/>
+              <w:bottom w:type="dxa" w:w="60"/>
+              <w:right w:type="dxa" w:w="100"/>
+            </w:tcMar>
+            <w:vAlign w:val="center"/>
+          </w:tcPr>
+          <w:p>
+            <w:pPr>
+              <w:spacing w:line="240" w:lineRule="auto"/>
+              <w:jc w:val="center"/>
+            </w:pPr>
+            <w:r>
+              <w:rPr>
+                <w:rFonts w:ascii="Arial" w:cs="Arial" w:eastAsia="Arial" w:hAnsi="Arial"/>
+                <w:b w:val="false"/>
+                <w:bCs w:val="false"/>
+                <w:i w:val="false"/>
+                <w:iCs w:val="false"/>
+                <w:color w:val="000000"/>
+                <w:sz w:val="20"/>
+                <w:szCs w:val="20"/>
+              </w:rPr>
+              <w:t xml:space="preserve">4.º trim. 2025</w:t>
+            </w:r>
+          </w:p>
+        </w:tc>
+        <w:tc>
+          <w:tcPr>
+            <w:tcW w:type="dxa" w:w="1874"/>
+            <w:tcMar>
+              <w:top w:type="dxa" w:w="60"/>
+              <w:left w:type="dxa" w:w="100"/>
+              <w:bottom w:type="dxa" w:w="60"/>
+              <w:right w:type="dxa" w:w="100"/>
+            </w:tcMar>
+            <w:vAlign w:val="center"/>
+          </w:tcPr>
+          <w:p>
+            <w:pPr>
+              <w:spacing w:line="240" w:lineRule="auto"/>
+              <w:jc w:val="center"/>
+            </w:pPr>
+            <w:r>
+              <w:rPr>
+                <w:rFonts w:ascii="Arial" w:cs="Arial" w:eastAsia="Arial" w:hAnsi="Arial"/>
+                <w:b w:val="false"/>
+                <w:bCs w:val="false"/>
+                <w:i w:val="false"/>
+                <w:iCs w:val="false"/>
+                <w:color w:val="000000"/>
+                <w:sz w:val="20"/>
+                <w:szCs w:val="20"/>
+              </w:rPr>
+              <w:t xml:space="preserve">Gasto USD 137,7 / 4,9 días</w:t>
+            </w:r>
+          </w:p>
+        </w:tc>
+        <w:tc>
+          <w:tcPr>
+            <w:tcW w:type="dxa" w:w="1802"/>
+            <w:tcMar>
+              <w:top w:type="dxa" w:w="60"/>
+              <w:left w:type="dxa" w:w="100"/>
+              <w:bottom w:type="dxa" w:w="60"/>
+              <w:right w:type="dxa" w:w="100"/>
+            </w:tcMar>
+            <w:vAlign w:val="center"/>
+          </w:tcPr>
+          <w:p>
+            <w:pPr>
+              <w:spacing w:line="240" w:lineRule="auto"/>
+              <w:jc w:val="center"/>
+            </w:pPr>
+            <w:r>
+              <w:rPr>
+                <w:rFonts w:ascii="Arial" w:cs="Arial" w:eastAsia="Arial" w:hAnsi="Arial"/>
+                <w:b w:val="false"/>
+                <w:bCs w:val="false"/>
+                <w:i w:val="false"/>
+                <w:iCs w:val="false"/>
+                <w:color w:val="000000"/>
+                <w:sz w:val="20"/>
+                <w:szCs w:val="20"/>
+              </w:rPr>
+              <w:t xml:space="preserve">Gasto USD 99,1 / 5,4 días</w:t>
+            </w:r>
+          </w:p>
+        </w:tc>
+        <w:tc>
+          <w:tcPr>
+            <w:tcW w:type="dxa" w:w="1874"/>
+            <w:tcMar>
+              <w:top w:type="dxa" w:w="60"/>
+              <w:left w:type="dxa" w:w="100"/>
+              <w:bottom w:type="dxa" w:w="60"/>
+              <w:right w:type="dxa" w:w="100"/>
+            </w:tcMar>
+            <w:vAlign w:val="center"/>
+          </w:tcPr>
+          <w:p>
+            <w:pPr>
+              <w:spacing w:line="240" w:lineRule="auto"/>
+              <w:jc w:val="center"/>
+            </w:pPr>
+            <w:r>
+              <w:rPr>
+                <w:rFonts w:ascii="Arial" w:cs="Arial" w:eastAsia="Arial" w:hAnsi="Arial"/>
+                <w:b w:val="false"/>
+                <w:bCs w:val="false"/>
+                <w:i w:val="false"/>
+                <w:iCs w:val="false"/>
+                <w:color w:val="000000"/>
+                <w:sz w:val="20"/>
+                <w:szCs w:val="20"/>
+              </w:rPr>
+              <w:t xml:space="preserve">Gasto USD 103,7 / 7,1 días</w:t>
             </w:r>
           </w:p>
         </w:tc>
@@ -5768,7 +5768,7 @@
           <w:sz w:val="20"/>
           <w:szCs w:val="20"/>
         </w:rPr>
-        <w:t xml:space="preserve"> Elaboración propia a partir de Ministerio de Turismo de Uruguay (2025a, 2025b, 2025c).</w:t>
+        <w:t xml:space="preserve"> Elaboración propia a partir de Ministerio de Turismo de Uruguay (2026a, 2026b, 2026c). Gasto diario por persona (P/P DÍA) en USD corrientes; corresponde a turismo receptivo (visitantes ingresados a Uruguay), no a turismo emisivo.</w:t>
       </w:r>
     </w:p>
     <w:p>
@@ -14999,7 +14999,7 @@
           <w:sz w:val="24"/>
           <w:szCs w:val="24"/>
         </w:rPr>
-        <w:t xml:space="preserve">Ministerio de Turismo de Uruguay. (2025a). Turismo emisivo: Cuarto trimestre 2024. Observatorio de Turismo Inteligente. https://www.gub.uy/ministerio-turismo/sites/ministerio-turismo/files/2025-01/E4T2024.pdf</w:t>
+        <w:t xml:space="preserve">Ministerio de Turismo de Uruguay. (2026a). Turismo receptivo: Cuarto trimestre 2025. Observatorio de Turismo Inteligente. https://www.gub.uy/ministerio-turismo/sites/ministerio-turismo/files/2026-04/Turismo_Receptivo_Cuarto_Trimestre_2025.pdf</w:t>
       </w:r>
     </w:p>
     <w:p>
@@ -15019,7 +15019,7 @@
           <w:sz w:val="24"/>
           <w:szCs w:val="24"/>
         </w:rPr>
-        <w:t xml:space="preserve">Ministerio de Turismo de Uruguay. (2025b). Turismo emisivo: Primer trimestre 2025. Observatorio de Turismo Inteligente. https://www.gub.uy/ministerio-turismo/sites/ministerio-turismo/files/2025-06/E-1T2025.pdf</w:t>
+        <w:t xml:space="preserve">Ministerio de Turismo de Uruguay. (2026b). Turismo receptivo: Primer trimestre 2026. Observatorio de Turismo Inteligente. https://www.gub.uy/ministerio-turismo/sites/ministerio-turismo/files/2026-05/ReceptivoQ1_2026%20-%20R_1T26.pdf</w:t>
       </w:r>
     </w:p>
     <w:p>
@@ -15039,7 +15039,7 @@
           <w:sz w:val="24"/>
           <w:szCs w:val="24"/>
         </w:rPr>
-        <w:t xml:space="preserve">Ministerio de Turismo de Uruguay. (2025c). Turismo emisivo: Tercer trimestre 2025. Observatorio de Turismo Inteligente. https://www.gub.uy/ministerio-turismo/sites/ministerio-turismo/files/2025-10/E3T25.pdf</w:t>
+        <w:t xml:space="preserve">Ministerio de Turismo de Uruguay. (2026c). Turismo receptivo: Segundo trimestre 2026. Observatorio de Turismo Inteligente. https://www.gub.uy/ministerio-turismo/sites/ministerio-turismo/files/2026-08/R-2T2026.pdf</w:t>
       </w:r>
     </w:p>
     <w:p>

</xml_diff>

<commit_message>
Add current, volatile brecha de precios data to Tabla 5 (Amenazas)
Downloaded and text-extracted UCU's actual March and July 2026 IPF
reports (Informe-IPF-MAR26.pdf, Informe-IPF-JUL26.pdf) rather than
relying on press paraphrases. The brecha did not stay low after its
March 2026 historical-minimum reading (15.1%) -- it widened back to
25.0% by July 2026 (wine specifically: 91.0%), which is a materially
different and more current story than steady convergence. Added both
verified data points; left sub-category cells as "s/d" where the
source PDF's chart-derived figures could not be attributed to a
specific month with confidence, rather than guessing.

Co-Authored-By: Claude Sonnet 5 <noreply@anthropic.com>
</commit_message>
<xml_diff>
--- a/La Ruta del Tannat - Proyecto Final.docx
+++ b/La Ruta del Tannat - Proyecto Final.docx
@@ -5885,10 +5885,10 @@
         </w:tblBorders>
       </w:tblPr>
       <w:tblGrid>
-        <w:gridCol w:w="1450"/>
-        <w:gridCol w:w="2223"/>
-        <w:gridCol w:w="2223"/>
-        <w:gridCol w:w="2609"/>
+        <w:gridCol w:w="1433"/>
+        <w:gridCol w:w="2293"/>
+        <w:gridCol w:w="2198"/>
+        <w:gridCol w:w="2580"/>
       </w:tblGrid>
       <w:tr>
         <w:trPr>
@@ -5896,7 +5896,7 @@
         </w:trPr>
         <w:tc>
           <w:tcPr>
-            <w:tcW w:type="dxa" w:w="1450"/>
+            <w:tcW w:type="dxa" w:w="1433"/>
             <w:shd w:fill="5b2333" w:val="clear"/>
             <w:tcMar>
               <w:top w:type="dxa" w:w="60"/>
@@ -5928,7 +5928,7 @@
         </w:tc>
         <w:tc>
           <w:tcPr>
-            <w:tcW w:type="dxa" w:w="2223"/>
+            <w:tcW w:type="dxa" w:w="2293"/>
             <w:shd w:fill="5b2333" w:val="clear"/>
             <w:tcMar>
               <w:top w:type="dxa" w:w="60"/>
@@ -5960,7 +5960,7 @@
         </w:tc>
         <w:tc>
           <w:tcPr>
-            <w:tcW w:type="dxa" w:w="2223"/>
+            <w:tcW w:type="dxa" w:w="2198"/>
             <w:shd w:fill="5b2333" w:val="clear"/>
             <w:tcMar>
               <w:top w:type="dxa" w:w="60"/>
@@ -5992,7 +5992,7 @@
         </w:tc>
         <w:tc>
           <w:tcPr>
-            <w:tcW w:type="dxa" w:w="2609"/>
+            <w:tcW w:type="dxa" w:w="2580"/>
             <w:shd w:fill="5b2333" w:val="clear"/>
             <w:tcMar>
               <w:top w:type="dxa" w:w="60"/>
@@ -6029,7 +6029,7 @@
         </w:trPr>
         <w:tc>
           <w:tcPr>
-            <w:tcW w:type="dxa" w:w="1450"/>
+            <w:tcW w:type="dxa" w:w="1433"/>
             <w:tcMar>
               <w:top w:type="dxa" w:w="60"/>
               <w:left w:type="dxa" w:w="100"/>
@@ -6060,7 +6060,7 @@
         </w:tc>
         <w:tc>
           <w:tcPr>
-            <w:tcW w:type="dxa" w:w="2223"/>
+            <w:tcW w:type="dxa" w:w="2293"/>
             <w:tcMar>
               <w:top w:type="dxa" w:w="60"/>
               <w:left w:type="dxa" w:w="100"/>
@@ -6091,7 +6091,7 @@
         </w:tc>
         <w:tc>
           <w:tcPr>
-            <w:tcW w:type="dxa" w:w="2223"/>
+            <w:tcW w:type="dxa" w:w="2198"/>
             <w:tcMar>
               <w:top w:type="dxa" w:w="60"/>
               <w:left w:type="dxa" w:w="100"/>
@@ -6122,7 +6122,7 @@
         </w:tc>
         <w:tc>
           <w:tcPr>
-            <w:tcW w:type="dxa" w:w="2609"/>
+            <w:tcW w:type="dxa" w:w="2580"/>
             <w:tcMar>
               <w:top w:type="dxa" w:w="60"/>
               <w:left w:type="dxa" w:w="100"/>
@@ -6158,7 +6158,7 @@
         </w:trPr>
         <w:tc>
           <w:tcPr>
-            <w:tcW w:type="dxa" w:w="1450"/>
+            <w:tcW w:type="dxa" w:w="1433"/>
             <w:tcMar>
               <w:top w:type="dxa" w:w="60"/>
               <w:left w:type="dxa" w:w="100"/>
@@ -6189,7 +6189,7 @@
         </w:tc>
         <w:tc>
           <w:tcPr>
-            <w:tcW w:type="dxa" w:w="2223"/>
+            <w:tcW w:type="dxa" w:w="2293"/>
             <w:tcMar>
               <w:top w:type="dxa" w:w="60"/>
               <w:left w:type="dxa" w:w="100"/>
@@ -6220,7 +6220,7 @@
         </w:tc>
         <w:tc>
           <w:tcPr>
-            <w:tcW w:type="dxa" w:w="2223"/>
+            <w:tcW w:type="dxa" w:w="2198"/>
             <w:tcMar>
               <w:top w:type="dxa" w:w="60"/>
               <w:left w:type="dxa" w:w="100"/>
@@ -6251,7 +6251,7 @@
         </w:tc>
         <w:tc>
           <w:tcPr>
-            <w:tcW w:type="dxa" w:w="2609"/>
+            <w:tcW w:type="dxa" w:w="2580"/>
             <w:tcMar>
               <w:top w:type="dxa" w:w="60"/>
               <w:left w:type="dxa" w:w="100"/>
@@ -6287,7 +6287,7 @@
         </w:trPr>
         <w:tc>
           <w:tcPr>
-            <w:tcW w:type="dxa" w:w="1450"/>
+            <w:tcW w:type="dxa" w:w="1433"/>
             <w:tcMar>
               <w:top w:type="dxa" w:w="60"/>
               <w:left w:type="dxa" w:w="100"/>
@@ -6318,7 +6318,7 @@
         </w:tc>
         <w:tc>
           <w:tcPr>
-            <w:tcW w:type="dxa" w:w="2223"/>
+            <w:tcW w:type="dxa" w:w="2293"/>
             <w:tcMar>
               <w:top w:type="dxa" w:w="60"/>
               <w:left w:type="dxa" w:w="100"/>
@@ -6349,7 +6349,7 @@
         </w:tc>
         <w:tc>
           <w:tcPr>
-            <w:tcW w:type="dxa" w:w="2223"/>
+            <w:tcW w:type="dxa" w:w="2198"/>
             <w:tcMar>
               <w:top w:type="dxa" w:w="60"/>
               <w:left w:type="dxa" w:w="100"/>
@@ -6380,7 +6380,7 @@
         </w:tc>
         <w:tc>
           <w:tcPr>
-            <w:tcW w:type="dxa" w:w="2609"/>
+            <w:tcW w:type="dxa" w:w="2580"/>
             <w:tcMar>
               <w:top w:type="dxa" w:w="60"/>
               <w:left w:type="dxa" w:w="100"/>
@@ -6416,7 +6416,136 @@
         </w:trPr>
         <w:tc>
           <w:tcPr>
-            <w:tcW w:type="dxa" w:w="1450"/>
+            <w:tcW w:type="dxa" w:w="1433"/>
+            <w:tcMar>
+              <w:top w:type="dxa" w:w="60"/>
+              <w:left w:type="dxa" w:w="100"/>
+              <w:bottom w:type="dxa" w:w="60"/>
+              <w:right w:type="dxa" w:w="100"/>
+            </w:tcMar>
+            <w:vAlign w:val="center"/>
+          </w:tcPr>
+          <w:p>
+            <w:pPr>
+              <w:spacing w:line="240" w:lineRule="auto"/>
+              <w:jc w:val="center"/>
+            </w:pPr>
+            <w:r>
+              <w:rPr>
+                <w:rFonts w:ascii="Arial" w:cs="Arial" w:eastAsia="Arial" w:hAnsi="Arial"/>
+                <w:b w:val="false"/>
+                <w:bCs w:val="false"/>
+                <w:i w:val="false"/>
+                <w:iCs w:val="false"/>
+                <w:color w:val="000000"/>
+                <w:sz w:val="20"/>
+                <w:szCs w:val="20"/>
+              </w:rPr>
+              <w:t xml:space="preserve">Mar. 2026</w:t>
+            </w:r>
+          </w:p>
+        </w:tc>
+        <w:tc>
+          <w:tcPr>
+            <w:tcW w:type="dxa" w:w="2293"/>
+            <w:tcMar>
+              <w:top w:type="dxa" w:w="60"/>
+              <w:left w:type="dxa" w:w="100"/>
+              <w:bottom w:type="dxa" w:w="60"/>
+              <w:right w:type="dxa" w:w="100"/>
+            </w:tcMar>
+            <w:vAlign w:val="center"/>
+          </w:tcPr>
+          <w:p>
+            <w:pPr>
+              <w:spacing w:line="240" w:lineRule="auto"/>
+              <w:jc w:val="center"/>
+            </w:pPr>
+            <w:r>
+              <w:rPr>
+                <w:rFonts w:ascii="Arial" w:cs="Arial" w:eastAsia="Arial" w:hAnsi="Arial"/>
+                <w:b w:val="false"/>
+                <w:bCs w:val="false"/>
+                <w:i w:val="false"/>
+                <w:iCs w:val="false"/>
+                <w:color w:val="000000"/>
+                <w:sz w:val="20"/>
+                <w:szCs w:val="20"/>
+              </w:rPr>
+              <w:t xml:space="preserve">15,1% (mínimo histórico)</w:t>
+            </w:r>
+          </w:p>
+        </w:tc>
+        <w:tc>
+          <w:tcPr>
+            <w:tcW w:type="dxa" w:w="2198"/>
+            <w:tcMar>
+              <w:top w:type="dxa" w:w="60"/>
+              <w:left w:type="dxa" w:w="100"/>
+              <w:bottom w:type="dxa" w:w="60"/>
+              <w:right w:type="dxa" w:w="100"/>
+            </w:tcMar>
+            <w:vAlign w:val="center"/>
+          </w:tcPr>
+          <w:p>
+            <w:pPr>
+              <w:spacing w:line="240" w:lineRule="auto"/>
+              <w:jc w:val="center"/>
+            </w:pPr>
+            <w:r>
+              <w:rPr>
+                <w:rFonts w:ascii="Arial" w:cs="Arial" w:eastAsia="Arial" w:hAnsi="Arial"/>
+                <w:b w:val="false"/>
+                <w:bCs w:val="false"/>
+                <w:i w:val="false"/>
+                <w:iCs w:val="false"/>
+                <w:color w:val="000000"/>
+                <w:sz w:val="20"/>
+                <w:szCs w:val="20"/>
+              </w:rPr>
+              <w:t xml:space="preserve">s/d</w:t>
+            </w:r>
+          </w:p>
+        </w:tc>
+        <w:tc>
+          <w:tcPr>
+            <w:tcW w:type="dxa" w:w="2580"/>
+            <w:tcMar>
+              <w:top w:type="dxa" w:w="60"/>
+              <w:left w:type="dxa" w:w="100"/>
+              <w:bottom w:type="dxa" w:w="60"/>
+              <w:right w:type="dxa" w:w="100"/>
+            </w:tcMar>
+            <w:vAlign w:val="center"/>
+          </w:tcPr>
+          <w:p>
+            <w:pPr>
+              <w:spacing w:line="240" w:lineRule="auto"/>
+              <w:jc w:val="center"/>
+            </w:pPr>
+            <w:r>
+              <w:rPr>
+                <w:rFonts w:ascii="Arial" w:cs="Arial" w:eastAsia="Arial" w:hAnsi="Arial"/>
+                <w:b w:val="false"/>
+                <w:bCs w:val="false"/>
+                <w:i w:val="false"/>
+                <w:iCs w:val="false"/>
+                <w:color w:val="000000"/>
+                <w:sz w:val="20"/>
+                <w:szCs w:val="20"/>
+              </w:rPr>
+              <w:t xml:space="preserve">s/d</w:t>
+            </w:r>
+          </w:p>
+        </w:tc>
+      </w:tr>
+      <w:tr>
+        <w:trPr>
+          <w:cantSplit/>
+        </w:trPr>
+        <w:tc>
+          <w:tcPr>
+            <w:tcW w:type="dxa" w:w="1433"/>
             <w:tcMar>
               <w:top w:type="dxa" w:w="60"/>
               <w:left w:type="dxa" w:w="100"/>
@@ -6447,7 +6576,7 @@
         </w:tc>
         <w:tc>
           <w:tcPr>
-            <w:tcW w:type="dxa" w:w="2223"/>
+            <w:tcW w:type="dxa" w:w="2293"/>
             <w:tcMar>
               <w:top w:type="dxa" w:w="60"/>
               <w:left w:type="dxa" w:w="100"/>
@@ -6478,7 +6607,7 @@
         </w:tc>
         <w:tc>
           <w:tcPr>
-            <w:tcW w:type="dxa" w:w="2223"/>
+            <w:tcW w:type="dxa" w:w="2198"/>
             <w:tcMar>
               <w:top w:type="dxa" w:w="60"/>
               <w:left w:type="dxa" w:w="100"/>
@@ -6509,7 +6638,7 @@
         </w:tc>
         <w:tc>
           <w:tcPr>
-            <w:tcW w:type="dxa" w:w="2609"/>
+            <w:tcW w:type="dxa" w:w="2580"/>
             <w:tcMar>
               <w:top w:type="dxa" w:w="60"/>
               <w:left w:type="dxa" w:w="100"/>
@@ -6535,6 +6664,135 @@
                 <w:szCs w:val="20"/>
               </w:rPr>
               <w:t xml:space="preserve">Diferencia moderada</w:t>
+            </w:r>
+          </w:p>
+        </w:tc>
+      </w:tr>
+      <w:tr>
+        <w:trPr>
+          <w:cantSplit/>
+        </w:trPr>
+        <w:tc>
+          <w:tcPr>
+            <w:tcW w:type="dxa" w:w="1433"/>
+            <w:tcMar>
+              <w:top w:type="dxa" w:w="60"/>
+              <w:left w:type="dxa" w:w="100"/>
+              <w:bottom w:type="dxa" w:w="60"/>
+              <w:right w:type="dxa" w:w="100"/>
+            </w:tcMar>
+            <w:vAlign w:val="center"/>
+          </w:tcPr>
+          <w:p>
+            <w:pPr>
+              <w:spacing w:line="240" w:lineRule="auto"/>
+              <w:jc w:val="center"/>
+            </w:pPr>
+            <w:r>
+              <w:rPr>
+                <w:rFonts w:ascii="Arial" w:cs="Arial" w:eastAsia="Arial" w:hAnsi="Arial"/>
+                <w:b w:val="false"/>
+                <w:bCs w:val="false"/>
+                <w:i w:val="false"/>
+                <w:iCs w:val="false"/>
+                <w:color w:val="000000"/>
+                <w:sz w:val="20"/>
+                <w:szCs w:val="20"/>
+              </w:rPr>
+              <w:t xml:space="preserve">Jul. 2026</w:t>
+            </w:r>
+          </w:p>
+        </w:tc>
+        <w:tc>
+          <w:tcPr>
+            <w:tcW w:type="dxa" w:w="2293"/>
+            <w:tcMar>
+              <w:top w:type="dxa" w:w="60"/>
+              <w:left w:type="dxa" w:w="100"/>
+              <w:bottom w:type="dxa" w:w="60"/>
+              <w:right w:type="dxa" w:w="100"/>
+            </w:tcMar>
+            <w:vAlign w:val="center"/>
+          </w:tcPr>
+          <w:p>
+            <w:pPr>
+              <w:spacing w:line="240" w:lineRule="auto"/>
+              <w:jc w:val="center"/>
+            </w:pPr>
+            <w:r>
+              <w:rPr>
+                <w:rFonts w:ascii="Arial" w:cs="Arial" w:eastAsia="Arial" w:hAnsi="Arial"/>
+                <w:b w:val="false"/>
+                <w:bCs w:val="false"/>
+                <w:i w:val="false"/>
+                <w:iCs w:val="false"/>
+                <w:color w:val="000000"/>
+                <w:sz w:val="20"/>
+                <w:szCs w:val="20"/>
+              </w:rPr>
+              <w:t xml:space="preserve">25,0%</w:t>
+            </w:r>
+          </w:p>
+        </w:tc>
+        <w:tc>
+          <w:tcPr>
+            <w:tcW w:type="dxa" w:w="2198"/>
+            <w:tcMar>
+              <w:top w:type="dxa" w:w="60"/>
+              <w:left w:type="dxa" w:w="100"/>
+              <w:bottom w:type="dxa" w:w="60"/>
+              <w:right w:type="dxa" w:w="100"/>
+            </w:tcMar>
+            <w:vAlign w:val="center"/>
+          </w:tcPr>
+          <w:p>
+            <w:pPr>
+              <w:spacing w:line="240" w:lineRule="auto"/>
+              <w:jc w:val="center"/>
+            </w:pPr>
+            <w:r>
+              <w:rPr>
+                <w:rFonts w:ascii="Arial" w:cs="Arial" w:eastAsia="Arial" w:hAnsi="Arial"/>
+                <w:b w:val="false"/>
+                <w:bCs w:val="false"/>
+                <w:i w:val="false"/>
+                <w:iCs w:val="false"/>
+                <w:color w:val="000000"/>
+                <w:sz w:val="20"/>
+                <w:szCs w:val="20"/>
+              </w:rPr>
+              <w:t xml:space="preserve">43,7% (vino: 91,0%)</w:t>
+            </w:r>
+          </w:p>
+        </w:tc>
+        <w:tc>
+          <w:tcPr>
+            <w:tcW w:type="dxa" w:w="2580"/>
+            <w:tcMar>
+              <w:top w:type="dxa" w:w="60"/>
+              <w:left w:type="dxa" w:w="100"/>
+              <w:bottom w:type="dxa" w:w="60"/>
+              <w:right w:type="dxa" w:w="100"/>
+            </w:tcMar>
+            <w:vAlign w:val="center"/>
+          </w:tcPr>
+          <w:p>
+            <w:pPr>
+              <w:spacing w:line="240" w:lineRule="auto"/>
+              <w:jc w:val="center"/>
+            </w:pPr>
+            <w:r>
+              <w:rPr>
+                <w:rFonts w:ascii="Arial" w:cs="Arial" w:eastAsia="Arial" w:hAnsi="Arial"/>
+                <w:b w:val="false"/>
+                <w:bCs w:val="false"/>
+                <w:i w:val="false"/>
+                <w:iCs w:val="false"/>
+                <w:color w:val="000000"/>
+                <w:sz w:val="20"/>
+                <w:szCs w:val="20"/>
+              </w:rPr>
+              <w:t xml:space="preserve">s/d</w:t>
             </w:r>
           </w:p>
         </w:tc>
@@ -6574,7 +6832,7 @@
           <w:sz w:val="20"/>
           <w:szCs w:val="20"/>
         </w:rPr>
-        <w:t xml:space="preserve"> Elaboración propia a partir de Observatorio Económico, Universidad Católica del Uruguay Campus Salto (2024) y de la prensa citada en las Referencias Bibliográficas.</w:t>
+        <w:t xml:space="preserve"> Elaboración propia a partir de Observatorio Económico, Universidad Católica del Uruguay Campus Salto (2024, 2026a, 2026b) y de la prensa citada en las Referencias Bibliográficas. s/d: dato no disponible en la fuente consultada para ese rubro y período.</w:t>
       </w:r>
     </w:p>
     <w:p>
@@ -6594,7 +6852,7 @@
           <w:sz w:val="24"/>
           <w:szCs w:val="24"/>
         </w:rPr>
-        <w:t xml:space="preserve">Esta brecha cambiaria favorece, además, la fuga de turistas de fin de semana hacia complejos termales argentinos (Federación, Villa Elisa), lo que afecta especialmente a productores y hoteles de nivel medio. Finalmente, constituye una amenaza estructural la contracción del registro de vitivinicultores nacionales (-11,55% anual en el período 2021-2024), que compromete la disponibilidad futura de recursos y subsidios.</w:t>
+        <w:t xml:space="preserve">Lejos de tratarse de una mejora sostenida, la brecha resultó altamente volátil a lo largo de 2026: tras tocar en marzo su mínimo histórico desde que se calcula el indicador (Observatorio Económico, Universidad Católica del Uruguay Campus Salto, 2026a), volvió a ampliarse hasta 25,0% en julio (Observatorio Económico, Universidad Católica del Uruguay Campus Salto, 2026b), confirmando que la competitividad de precios de Salto frente a Concordia depende de variables cambiarias fuera del control del proyecto y debe monitorearse de forma continua antes que darse por superada. Esta brecha cambiaria favorece, además, la fuga de turistas de fin de semana hacia complejos termales argentinos (Federación, Villa Elisa), lo que afecta especialmente a productores y hoteles de nivel medio. Finalmente, constituye una amenaza estructural la contracción del registro de vitivinicultores nacionales (-11,55% anual en el período 2021-2024), que compromete la disponibilidad futura de recursos y subsidios.</w:t>
       </w:r>
     </w:p>
     <w:p>
@@ -15160,6 +15418,46 @@
           <w:szCs w:val="24"/>
         </w:rPr>
         <w:t xml:space="preserve">Observatorio Económico, Universidad Católica del Uruguay Campus Salto [UCU]. (2025). Estudio del perfil del turista de la Región de Salto Grande.</w:t>
+      </w:r>
+    </w:p>
+    <w:p>
+      <w:pPr>
+        <w:spacing w:after="160" w:line="240" w:lineRule="auto"/>
+        <w:ind w:left="720" w:hanging="720"/>
+        <w:jc w:val="left"/>
+      </w:pPr>
+      <w:r>
+        <w:rPr>
+          <w:rFonts w:ascii="Arial" w:cs="Arial" w:eastAsia="Arial" w:hAnsi="Arial"/>
+          <w:b w:val="false"/>
+          <w:bCs w:val="false"/>
+          <w:i w:val="false"/>
+          <w:iCs w:val="false"/>
+          <w:color w:val="000000"/>
+          <w:sz w:val="24"/>
+          <w:szCs w:val="24"/>
+        </w:rPr>
+        <w:t xml:space="preserve">Observatorio Económico, Universidad Católica del Uruguay Campus Salto [UCU]. (2026a). Indicador de Precios Fronterizos, marzo 2026. https://www.ucu.edu.uy/Institucionales/INFORMES-uc1313/7434/Informe-IPF-MAR26.pdf</w:t>
+      </w:r>
+    </w:p>
+    <w:p>
+      <w:pPr>
+        <w:spacing w:after="160" w:line="240" w:lineRule="auto"/>
+        <w:ind w:left="720" w:hanging="720"/>
+        <w:jc w:val="left"/>
+      </w:pPr>
+      <w:r>
+        <w:rPr>
+          <w:rFonts w:ascii="Arial" w:cs="Arial" w:eastAsia="Arial" w:hAnsi="Arial"/>
+          <w:b w:val="false"/>
+          <w:bCs w:val="false"/>
+          <w:i w:val="false"/>
+          <w:iCs w:val="false"/>
+          <w:color w:val="000000"/>
+          <w:sz w:val="24"/>
+          <w:szCs w:val="24"/>
+        </w:rPr>
+        <w:t xml:space="preserve">Observatorio Económico, Universidad Católica del Uruguay Campus Salto [UCU]. (2026b). Indicador de Precios Fronterizos, julio 2026. https://www.ucu.edu.uy/Institucionales/INFORMES-uc1313/8017/Informe-IPF-JUL26.pdf</w:t>
       </w:r>
     </w:p>
     <w:p>

</xml_diff>

<commit_message>
Add 2025 INAVI vineyard registry data to Tabla 3
INAVI's website now publishes a 2025 edition (Reporte Anual, Registro
de Viñedos Uruguay 2025, dated April 2025) beyond the 2021/2023/2024
data the table had. Downloaded and text-extracted the actual PDF:
viñedos vigentes (1.048), superficie cultivada (5.797,80 ha) and
empresas registradas (676) all continue the declining trend already
documented -- a real, current data point strengthening the diagnostic
argument. "Productores activos" isn't broken out in this report
edition, so that cell is marked s/d rather than guessed.

Co-Authored-By: Claude Sonnet 5 <noreply@anthropic.com>
</commit_message>
<xml_diff>
--- a/La Ruta del Tannat - Proyecto Final.docx
+++ b/La Ruta del Tannat - Proyecto Final.docx
@@ -4127,7 +4127,7 @@
           <w:sz w:val="24"/>
           <w:szCs w:val="24"/>
         </w:rPr>
-        <w:t xml:space="preserve">Los datos oficiales de INAVI (período 2021-2024) reflejan una tendencia de reconversión estructural del rubro vitivinícola en Uruguay:</w:t>
+        <w:t xml:space="preserve">Los datos oficiales de INAVI (período 2021-2025) reflejan una tendencia de reconversión estructural del rubro vitivinícola en Uruguay, que el último registro disponible confirma que continúa vigente:</w:t>
       </w:r>
     </w:p>
     <w:p>
@@ -4167,7 +4167,7 @@
           <w:sz w:val="24"/>
           <w:szCs w:val="24"/>
         </w:rPr>
-        <w:t xml:space="preserve">Evolución de indicadores vitivinícolas nacionales, 2021-2024</w:t>
+        <w:t xml:space="preserve">Evolución de indicadores vitivinícolas nacionales, 2021-2025</w:t>
       </w:r>
     </w:p>
     <w:tbl>
@@ -4183,11 +4183,12 @@
         </w:tblBorders>
       </w:tblPr>
       <w:tblGrid>
-        <w:gridCol w:w="3510"/>
-        <w:gridCol w:w="1080"/>
-        <w:gridCol w:w="1080"/>
-        <w:gridCol w:w="1080"/>
-        <w:gridCol w:w="1755"/>
+        <w:gridCol w:w="2567"/>
+        <w:gridCol w:w="867"/>
+        <w:gridCol w:w="867"/>
+        <w:gridCol w:w="867"/>
+        <w:gridCol w:w="867"/>
+        <w:gridCol w:w="2468"/>
       </w:tblGrid>
       <w:tr>
         <w:trPr>
@@ -4195,7 +4196,7 @@
         </w:trPr>
         <w:tc>
           <w:tcPr>
-            <w:tcW w:type="dxa" w:w="3510"/>
+            <w:tcW w:type="dxa" w:w="2567"/>
             <w:shd w:fill="5b2333" w:val="clear"/>
             <w:tcMar>
               <w:top w:type="dxa" w:w="60"/>
@@ -4227,7 +4228,7 @@
         </w:tc>
         <w:tc>
           <w:tcPr>
-            <w:tcW w:type="dxa" w:w="1080"/>
+            <w:tcW w:type="dxa" w:w="867"/>
             <w:shd w:fill="5b2333" w:val="clear"/>
             <w:tcMar>
               <w:top w:type="dxa" w:w="60"/>
@@ -4259,7 +4260,7 @@
         </w:tc>
         <w:tc>
           <w:tcPr>
-            <w:tcW w:type="dxa" w:w="1080"/>
+            <w:tcW w:type="dxa" w:w="867"/>
             <w:shd w:fill="5b2333" w:val="clear"/>
             <w:tcMar>
               <w:top w:type="dxa" w:w="60"/>
@@ -4291,7 +4292,7 @@
         </w:tc>
         <w:tc>
           <w:tcPr>
-            <w:tcW w:type="dxa" w:w="1080"/>
+            <w:tcW w:type="dxa" w:w="867"/>
             <w:shd w:fill="5b2333" w:val="clear"/>
             <w:tcMar>
               <w:top w:type="dxa" w:w="60"/>
@@ -4323,7 +4324,7 @@
         </w:tc>
         <w:tc>
           <w:tcPr>
-            <w:tcW w:type="dxa" w:w="1755"/>
+            <w:tcW w:type="dxa" w:w="867"/>
             <w:shd w:fill="5b2333" w:val="clear"/>
             <w:tcMar>
               <w:top w:type="dxa" w:w="60"/>
@@ -4349,7 +4350,39 @@
                 <w:sz w:val="20"/>
                 <w:szCs w:val="20"/>
               </w:rPr>
-              <w:t xml:space="preserve">Tendencia</w:t>
+              <w:t xml:space="preserve">2025</w:t>
+            </w:r>
+          </w:p>
+        </w:tc>
+        <w:tc>
+          <w:tcPr>
+            <w:tcW w:type="dxa" w:w="2468"/>
+            <w:shd w:fill="5b2333" w:val="clear"/>
+            <w:tcMar>
+              <w:top w:type="dxa" w:w="60"/>
+              <w:left w:type="dxa" w:w="100"/>
+              <w:bottom w:type="dxa" w:w="60"/>
+              <w:right w:type="dxa" w:w="100"/>
+            </w:tcMar>
+            <w:vAlign w:val="center"/>
+          </w:tcPr>
+          <w:p>
+            <w:pPr>
+              <w:spacing w:line="240" w:lineRule="auto"/>
+              <w:jc w:val="center"/>
+            </w:pPr>
+            <w:r>
+              <w:rPr>
+                <w:rFonts w:ascii="Arial" w:cs="Arial" w:eastAsia="Arial" w:hAnsi="Arial"/>
+                <w:b/>
+                <w:bCs/>
+                <w:i w:val="false"/>
+                <w:iCs w:val="false"/>
+                <w:color w:val="ffffff"/>
+                <w:sz w:val="20"/>
+                <w:szCs w:val="20"/>
+              </w:rPr>
+              <w:t xml:space="preserve">Tendencia (2021-2024)</w:t>
             </w:r>
           </w:p>
         </w:tc>
@@ -4360,7 +4393,7 @@
         </w:trPr>
         <w:tc>
           <w:tcPr>
-            <w:tcW w:type="dxa" w:w="3510"/>
+            <w:tcW w:type="dxa" w:w="2567"/>
             <w:tcMar>
               <w:top w:type="dxa" w:w="60"/>
               <w:left w:type="dxa" w:w="100"/>
@@ -4391,7 +4424,7 @@
         </w:tc>
         <w:tc>
           <w:tcPr>
-            <w:tcW w:type="dxa" w:w="1080"/>
+            <w:tcW w:type="dxa" w:w="867"/>
             <w:tcMar>
               <w:top w:type="dxa" w:w="60"/>
               <w:left w:type="dxa" w:w="100"/>
@@ -4422,7 +4455,7 @@
         </w:tc>
         <w:tc>
           <w:tcPr>
-            <w:tcW w:type="dxa" w:w="1080"/>
+            <w:tcW w:type="dxa" w:w="867"/>
             <w:tcMar>
               <w:top w:type="dxa" w:w="60"/>
               <w:left w:type="dxa" w:w="100"/>
@@ -4453,7 +4486,7 @@
         </w:tc>
         <w:tc>
           <w:tcPr>
-            <w:tcW w:type="dxa" w:w="1080"/>
+            <w:tcW w:type="dxa" w:w="867"/>
             <w:tcMar>
               <w:top w:type="dxa" w:w="60"/>
               <w:left w:type="dxa" w:w="100"/>
@@ -4484,7 +4517,38 @@
         </w:tc>
         <w:tc>
           <w:tcPr>
-            <w:tcW w:type="dxa" w:w="1755"/>
+            <w:tcW w:type="dxa" w:w="867"/>
+            <w:tcMar>
+              <w:top w:type="dxa" w:w="60"/>
+              <w:left w:type="dxa" w:w="100"/>
+              <w:bottom w:type="dxa" w:w="60"/>
+              <w:right w:type="dxa" w:w="100"/>
+            </w:tcMar>
+            <w:vAlign w:val="center"/>
+          </w:tcPr>
+          <w:p>
+            <w:pPr>
+              <w:spacing w:line="240" w:lineRule="auto"/>
+              <w:jc w:val="center"/>
+            </w:pPr>
+            <w:r>
+              <w:rPr>
+                <w:rFonts w:ascii="Arial" w:cs="Arial" w:eastAsia="Arial" w:hAnsi="Arial"/>
+                <w:b w:val="false"/>
+                <w:bCs w:val="false"/>
+                <w:i w:val="false"/>
+                <w:iCs w:val="false"/>
+                <w:color w:val="000000"/>
+                <w:sz w:val="20"/>
+                <w:szCs w:val="20"/>
+              </w:rPr>
+              <w:t xml:space="preserve">1.048</w:t>
+            </w:r>
+          </w:p>
+        </w:tc>
+        <w:tc>
+          <w:tcPr>
+            <w:tcW w:type="dxa" w:w="2468"/>
             <w:tcMar>
               <w:top w:type="dxa" w:w="60"/>
               <w:left w:type="dxa" w:w="100"/>
@@ -4520,7 +4584,7 @@
         </w:trPr>
         <w:tc>
           <w:tcPr>
-            <w:tcW w:type="dxa" w:w="3510"/>
+            <w:tcW w:type="dxa" w:w="2567"/>
             <w:tcMar>
               <w:top w:type="dxa" w:w="60"/>
               <w:left w:type="dxa" w:w="100"/>
@@ -4551,7 +4615,7 @@
         </w:tc>
         <w:tc>
           <w:tcPr>
-            <w:tcW w:type="dxa" w:w="1080"/>
+            <w:tcW w:type="dxa" w:w="867"/>
             <w:tcMar>
               <w:top w:type="dxa" w:w="60"/>
               <w:left w:type="dxa" w:w="100"/>
@@ -4582,7 +4646,7 @@
         </w:tc>
         <w:tc>
           <w:tcPr>
-            <w:tcW w:type="dxa" w:w="1080"/>
+            <w:tcW w:type="dxa" w:w="867"/>
             <w:tcMar>
               <w:top w:type="dxa" w:w="60"/>
               <w:left w:type="dxa" w:w="100"/>
@@ -4613,7 +4677,7 @@
         </w:tc>
         <w:tc>
           <w:tcPr>
-            <w:tcW w:type="dxa" w:w="1080"/>
+            <w:tcW w:type="dxa" w:w="867"/>
             <w:tcMar>
               <w:top w:type="dxa" w:w="60"/>
               <w:left w:type="dxa" w:w="100"/>
@@ -4644,7 +4708,38 @@
         </w:tc>
         <w:tc>
           <w:tcPr>
-            <w:tcW w:type="dxa" w:w="1755"/>
+            <w:tcW w:type="dxa" w:w="867"/>
+            <w:tcMar>
+              <w:top w:type="dxa" w:w="60"/>
+              <w:left w:type="dxa" w:w="100"/>
+              <w:bottom w:type="dxa" w:w="60"/>
+              <w:right w:type="dxa" w:w="100"/>
+            </w:tcMar>
+            <w:vAlign w:val="center"/>
+          </w:tcPr>
+          <w:p>
+            <w:pPr>
+              <w:spacing w:line="240" w:lineRule="auto"/>
+              <w:jc w:val="center"/>
+            </w:pPr>
+            <w:r>
+              <w:rPr>
+                <w:rFonts w:ascii="Arial" w:cs="Arial" w:eastAsia="Arial" w:hAnsi="Arial"/>
+                <w:b w:val="false"/>
+                <w:bCs w:val="false"/>
+                <w:i w:val="false"/>
+                <w:iCs w:val="false"/>
+                <w:color w:val="000000"/>
+                <w:sz w:val="20"/>
+                <w:szCs w:val="20"/>
+              </w:rPr>
+              <w:t xml:space="preserve">5.797,80</w:t>
+            </w:r>
+          </w:p>
+        </w:tc>
+        <w:tc>
+          <w:tcPr>
+            <w:tcW w:type="dxa" w:w="2468"/>
             <w:tcMar>
               <w:top w:type="dxa" w:w="60"/>
               <w:left w:type="dxa" w:w="100"/>
@@ -4680,7 +4775,7 @@
         </w:trPr>
         <w:tc>
           <w:tcPr>
-            <w:tcW w:type="dxa" w:w="3510"/>
+            <w:tcW w:type="dxa" w:w="2567"/>
             <w:tcMar>
               <w:top w:type="dxa" w:w="60"/>
               <w:left w:type="dxa" w:w="100"/>
@@ -4711,7 +4806,7 @@
         </w:tc>
         <w:tc>
           <w:tcPr>
-            <w:tcW w:type="dxa" w:w="1080"/>
+            <w:tcW w:type="dxa" w:w="867"/>
             <w:tcMar>
               <w:top w:type="dxa" w:w="60"/>
               <w:left w:type="dxa" w:w="100"/>
@@ -4742,7 +4837,7 @@
         </w:tc>
         <w:tc>
           <w:tcPr>
-            <w:tcW w:type="dxa" w:w="1080"/>
+            <w:tcW w:type="dxa" w:w="867"/>
             <w:tcMar>
               <w:top w:type="dxa" w:w="60"/>
               <w:left w:type="dxa" w:w="100"/>
@@ -4773,7 +4868,7 @@
         </w:tc>
         <w:tc>
           <w:tcPr>
-            <w:tcW w:type="dxa" w:w="1080"/>
+            <w:tcW w:type="dxa" w:w="867"/>
             <w:tcMar>
               <w:top w:type="dxa" w:w="60"/>
               <w:left w:type="dxa" w:w="100"/>
@@ -4804,7 +4899,38 @@
         </w:tc>
         <w:tc>
           <w:tcPr>
-            <w:tcW w:type="dxa" w:w="1755"/>
+            <w:tcW w:type="dxa" w:w="867"/>
+            <w:tcMar>
+              <w:top w:type="dxa" w:w="60"/>
+              <w:left w:type="dxa" w:w="100"/>
+              <w:bottom w:type="dxa" w:w="60"/>
+              <w:right w:type="dxa" w:w="100"/>
+            </w:tcMar>
+            <w:vAlign w:val="center"/>
+          </w:tcPr>
+          <w:p>
+            <w:pPr>
+              <w:spacing w:line="240" w:lineRule="auto"/>
+              <w:jc w:val="center"/>
+            </w:pPr>
+            <w:r>
+              <w:rPr>
+                <w:rFonts w:ascii="Arial" w:cs="Arial" w:eastAsia="Arial" w:hAnsi="Arial"/>
+                <w:b w:val="false"/>
+                <w:bCs w:val="false"/>
+                <w:i w:val="false"/>
+                <w:iCs w:val="false"/>
+                <w:color w:val="000000"/>
+                <w:sz w:val="20"/>
+                <w:szCs w:val="20"/>
+              </w:rPr>
+              <w:t xml:space="preserve">s/d</w:t>
+            </w:r>
+          </w:p>
+        </w:tc>
+        <w:tc>
+          <w:tcPr>
+            <w:tcW w:type="dxa" w:w="2468"/>
             <w:tcMar>
               <w:top w:type="dxa" w:w="60"/>
               <w:left w:type="dxa" w:w="100"/>
@@ -4840,7 +4966,7 @@
         </w:trPr>
         <w:tc>
           <w:tcPr>
-            <w:tcW w:type="dxa" w:w="3510"/>
+            <w:tcW w:type="dxa" w:w="2567"/>
             <w:tcMar>
               <w:top w:type="dxa" w:w="60"/>
               <w:left w:type="dxa" w:w="100"/>
@@ -4871,7 +4997,7 @@
         </w:tc>
         <w:tc>
           <w:tcPr>
-            <w:tcW w:type="dxa" w:w="1080"/>
+            <w:tcW w:type="dxa" w:w="867"/>
             <w:tcMar>
               <w:top w:type="dxa" w:w="60"/>
               <w:left w:type="dxa" w:w="100"/>
@@ -4902,7 +5028,7 @@
         </w:tc>
         <w:tc>
           <w:tcPr>
-            <w:tcW w:type="dxa" w:w="1080"/>
+            <w:tcW w:type="dxa" w:w="867"/>
             <w:tcMar>
               <w:top w:type="dxa" w:w="60"/>
               <w:left w:type="dxa" w:w="100"/>
@@ -4933,7 +5059,7 @@
         </w:tc>
         <w:tc>
           <w:tcPr>
-            <w:tcW w:type="dxa" w:w="1080"/>
+            <w:tcW w:type="dxa" w:w="867"/>
             <w:tcMar>
               <w:top w:type="dxa" w:w="60"/>
               <w:left w:type="dxa" w:w="100"/>
@@ -4964,7 +5090,38 @@
         </w:tc>
         <w:tc>
           <w:tcPr>
-            <w:tcW w:type="dxa" w:w="1755"/>
+            <w:tcW w:type="dxa" w:w="867"/>
+            <w:tcMar>
+              <w:top w:type="dxa" w:w="60"/>
+              <w:left w:type="dxa" w:w="100"/>
+              <w:bottom w:type="dxa" w:w="60"/>
+              <w:right w:type="dxa" w:w="100"/>
+            </w:tcMar>
+            <w:vAlign w:val="center"/>
+          </w:tcPr>
+          <w:p>
+            <w:pPr>
+              <w:spacing w:line="240" w:lineRule="auto"/>
+              <w:jc w:val="center"/>
+            </w:pPr>
+            <w:r>
+              <w:rPr>
+                <w:rFonts w:ascii="Arial" w:cs="Arial" w:eastAsia="Arial" w:hAnsi="Arial"/>
+                <w:b w:val="false"/>
+                <w:bCs w:val="false"/>
+                <w:i w:val="false"/>
+                <w:iCs w:val="false"/>
+                <w:color w:val="000000"/>
+                <w:sz w:val="20"/>
+                <w:szCs w:val="20"/>
+              </w:rPr>
+              <w:t xml:space="preserve">676</w:t>
+            </w:r>
+          </w:p>
+        </w:tc>
+        <w:tc>
+          <w:tcPr>
+            <w:tcW w:type="dxa" w:w="2468"/>
             <w:tcMar>
               <w:top w:type="dxa" w:w="60"/>
               <w:left w:type="dxa" w:w="100"/>
@@ -5029,7 +5186,7 @@
           <w:sz w:val="20"/>
           <w:szCs w:val="20"/>
         </w:rPr>
-        <w:t xml:space="preserve"> Elaboración propia a partir de INAVI (2021, 2023a, 2023b, 2024b).</w:t>
+        <w:t xml:space="preserve"> Elaboración propia a partir de INAVI (2021, 2023a, 2023b, 2024b, 2025). La columna Tendencia refleja la variación 2021-2024, único período con dato de Productores activos disponible en las cuatro fuentes; s/d: dato no desagregado en el reporte 2025 consultado.</w:t>
       </w:r>
     </w:p>
     <w:p>
@@ -14938,6 +15095,26 @@
           <w:szCs w:val="24"/>
         </w:rPr>
         <w:t xml:space="preserve">Instituto Nacional de Vitivinicultura [INAVI]. (2024b). Reporte INAVI 2024. https://www.inavi.com.uy/uploads/vinedo/346bb91b94f57f26d3e293b52fc0059a83b273cf.pdf</w:t>
+      </w:r>
+    </w:p>
+    <w:p>
+      <w:pPr>
+        <w:spacing w:after="160" w:line="240" w:lineRule="auto"/>
+        <w:ind w:left="720" w:hanging="720"/>
+        <w:jc w:val="left"/>
+      </w:pPr>
+      <w:r>
+        <w:rPr>
+          <w:rFonts w:ascii="Arial" w:cs="Arial" w:eastAsia="Arial" w:hAnsi="Arial"/>
+          <w:b w:val="false"/>
+          <w:bCs w:val="false"/>
+          <w:i w:val="false"/>
+          <w:iCs w:val="false"/>
+          <w:color w:val="000000"/>
+          <w:sz w:val="24"/>
+          <w:szCs w:val="24"/>
+        </w:rPr>
+        <w:t xml:space="preserve">Instituto Nacional de Vitivinicultura [INAVI]. (2025). Reporte anual, Registro de Viñedos Uruguay 2025. https://www.inavi.com.uy/uploads/vinedo/744a55025d144bfb1b83e7f6e8c1966f451672c9.pdf</w:t>
       </w:r>
     </w:p>
     <w:p>

</xml_diff>

<commit_message>
Fix source misattribution in Chapter 1's opening statistic; verify wineries
The 453,936-visitor / USD 189 figures opening the Justificación section
were attributed to a UCU study, but independent press coverage
consistently attributes them to CERES. The UCU "Estudio del perfil del
turista de la Región de Salto Grande" is real and was verified (160
attendees, backed by Uruguay's delegation to the Comisión Técnica
Mixta de Salto Grande), but its own reported findings are a different
metric (USD 129/107 per-group daily spend in Daymán/Federación) --
added those properly instead of leaving them conflated with the CERES
figures.

Verified winery facts against primary/independent sources: Salto
Chico's 6 ha (confirmed via saltochico.com.uy) and Bertolini &
Broglio's km 468.5 location and 200,000 L capacity both check out;
added Bertolini & Broglio's 14.5 ha (already established elsewhere in
this project) with its citation.

Co-Authored-By: Claude Sonnet 5 <noreply@anthropic.com>
</commit_message>
<xml_diff>
--- a/La Ruta del Tannat - Proyecto Final.docx
+++ b/La Ruta del Tannat - Proyecto Final.docx
@@ -978,7 +978,7 @@
           <w:sz w:val="24"/>
           <w:szCs w:val="24"/>
         </w:rPr>
-        <w:t xml:space="preserve">La justificación económica y social de la propuesta radica en la necesidad de corregir las debilidades del modelo turístico del departamento de Salto. El turismo en Uruguay es un motor crítico, que genera ingresos agregados por USD 2.040 millones (CAMAERO, s.f.). Sin embargo, según el “Estudio del perfil del turista de la Región de Salto Grande” (Observatorio Económico, Universidad Católica del Uruguay Campus Salto, 2025), el Litoral Termal presenta una brecha frente a otras regiones del país: recibe un volumen de visitantes elevado —453.936 personas anuales— pero su gasto acumulado se limita a USD 86 millones, lo que arroja un gasto promedio por persona de solo USD 189. En contraste, Colonia del Sacramento recibe un flujo similar (469.297 visitantes) pero genera USD 113 millones, con un gasto promedio de USD 241, mientras que Maldonado capta un gasto promedio de USD 569. Esto indica que el modelo termal salteño atrae un perfil de demanda de bajo gasto y baja diversificación recreativa.</w:t>
+        <w:t xml:space="preserve">La justificación económica y social de la propuesta radica en la necesidad de corregir las debilidades del modelo turístico del departamento de Salto. El turismo en Uruguay es un motor crítico, que genera ingresos agregados por USD 2.040 millones (CAMAERO, s.f.). Sin embargo, según CERES (2026), el Litoral Termal presenta una brecha frente a otras regiones del país: recibe un volumen de visitantes elevado —453.936 personas anuales— pero su gasto acumulado se limita a USD 86 millones, lo que arroja un gasto promedio por persona de solo USD 189, muy por debajo del promedio nacional de USD 566. En contraste, Colonia del Sacramento recibe un flujo similar (469.297 visitantes) pero genera USD 113 millones, con un gasto promedio de USD 241, mientras que Maldonado capta un gasto promedio de USD 569. Esta brecha de bajo gasto es coherente con lo relevado en profundidad por el “Estudio del perfil del turista de la Región de Salto Grande” (Observatorio Económico, Universidad Católica del Uruguay Campus Salto, 2025) —presentado ante 160 asistentes en el Campus Salto con el respaldo de la Delegación uruguaya en la Comisión Técnica Mixta de Salto Grande—: el gasto promedio por grupo familiar se ubicó en apenas USD 129 diarios en Daymán y USD 107 en Federación, del lado argentino, confirmando que el modelo termal binacional del litoral compite hoy por un segmento de bajo desembolso. Esto indica que el modelo termal salteño atrae un perfil de demanda de bajo gasto y baja diversificación recreativa.</w:t>
       </w:r>
     </w:p>
     <w:p>
@@ -7392,7 +7392,7 @@
           <w:sz w:val="24"/>
           <w:szCs w:val="24"/>
         </w:rPr>
-        <w:t xml:space="preserve">En el km 468,5 de la Ruta 3, a 8 km de las Termas del Daymán. Bodega boutique con capacidad de producción de 200.000 litros anuales; los visitantes observan el proceso de vinificación por gravedad y cierran con una cata de varietales selectos (Viognier, Malbec, Syrah) y el corte Syrah-Tannat de alta gama.</w:t>
+        <w:t xml:space="preserve">En el km 468,5 de la Ruta 3, a 8 km de las Termas del Daymán. Bodega boutique de 14,5 hectáreas de viñedo, con capacidad de producción de 200.000 litros anuales (Por las Catas, 2018); los visitantes observan el proceso de vinificación por gravedad y cierran con una cata de varietales selectos (Viognier, Malbec, Syrah) y el corte Syrah-Tannat de alta gama.</w:t>
       </w:r>
     </w:p>
     <w:p>

</xml_diff>